<commit_message>
Enhance interactive visualization with Apache ECharts, add core scopus_eda_analysis.py, and synchronize academic report and slides
</commit_message>
<xml_diff>
--- a/report/EDA_Scopus_Report.docx
+++ b/report/EDA_Scopus_Report.docx
@@ -95,7 +95,7 @@
           <w:rFonts w:ascii="TH Sarabun New" w:hAnsi="TH Sarabun New"/>
           <w:sz w:val="32"/>
         </w:rPr>
-        <w:t>รายงาน​ฉบับ​นี้​นำเสนอ​กระบวนการ​วิเคราะห์​ข้อมูล​เชิง​สำรวจ (Exploratory Data Analysis: EDA) และ​การ​เตรียม​ความพร้อม​ของ​ข้อมูล​งานวิจัย​ทาง​วิทยาการ​คอมพิวเตอร์​จาก​ฐานข้อมูล​วิชาการ Scopus จำนวน​ทั้งสิ้น 10 สาขาวิชา (Subject Areas) เพื่อ​รองรับ​การนำ​ไป​เรียนรู้​ต่อยอด​ด้วย​โมเดล​การเรียนรู้​ของ​เครื่อง (Machine Learning) และ​ระบบ​ประมวลผล​ภาษาธรรมชาติ (NLP) โดย​กลุ่ม​ผู้จัดทำ​ได้​รวบรวม​ข้อมูลดิบ​จำนวน 7,280 รายการ (เฉลี่ย​สาขา​ละ 728 รายการ) และ​ดำเนินการ​ตรวจสอบ​คุณภาพ​ข้อมูล​ตาม​โจทย์​ที่​ได้​รับมอบหมาย​อย่าง​เคร่งครัด</w:t>
+        <w:t>รายงาน​ฉบับ​นี้​นำเสนอ​กระบวนการ​วิเคราะห์​ข้อมูล​เชิง​สำรวจ (Exploratory Data Analysis: EDA) และ​การ​เตรียม​ความพร้อม​ของ​ชุด​ข้อมูล​งานวิจัย​ทาง​วิทยาการ​คอมพิวเตอร์​จาก​ฐานข้อมูล​วิชาการ​ระดับ​สากล Scopus ครอบคลุม 10 สาขาวิชา​หลัก เพื่อ​ทำความเข้าใจ​โครง​สร้างความสัมพันธ์​ของ​คำ​สำคัญ ความ​เชื่อมโยง​ข้าม​ศาสตร์ และ​การ​เตรียม​คุณลักษณะ (Feature Engineering) สำหรับ​ป้อน​เข้าสู่​โมเดล Machine Learning ใน​การสกัด​เวกเตอร์​ความหมาย (Text Embedding) โดย​กลุ่ม​ผู้จัดทำ​ได้​รวบรวม​ข้อมูลดิบ​จำนวน 7,280 รายการ และ​นำมา​ประมวลผล​ผ่าน​กระบวนการ​ตรวจสอบ​คุณภาพ​ข้อมูล​อย่าง​เข้มงวด</w:t>
       </w:r>
     </w:p>
     <w:p>
@@ -109,7 +109,7 @@
           <w:rFonts w:ascii="TH Sarabun New" w:hAnsi="TH Sarabun New"/>
           <w:sz w:val="32"/>
         </w:rPr>
-        <w:t>ผล​การ​ทำความสะอาด​ข้อมูล (Data Cleaning) พบ​ความผิดปกติ​ของ​ข้อมูล ได้แก่ บทความ​ที่​มี​การปรากฏ​ซ้ำซ้อน​ข้าม​สาขาวิชา​จำนวน 178 รายการ, บทความ​ที่​ใช้​ภาษา​อื่น​ที่​ไม่​ใช่​ภาษาอังกฤษ​จำนวน 25 รายการ, บทความ​ที่​ขาด​บทคัดย่อ​จำนวน 30 รายการ, และ​บทความ​นอก​บริบท​วิทยาการ​คอมพิวเตอร์ ที่​หลุด​เข้า​มาจาก​การ​สืบค้น (เช่น อสังหาริมทรัพย์​ใน​ดูไบ การ​จัดการ​โรงแรม ทันตกรรม และ​การเกษตร) จำนวน 59 รายการ หลัง​การ​ขจัด​สิ่งเจือปน​ทั้งหมด คงเหลือ​ชุด​ข้อมูล​สะอาด​พร้อม​ใช้งาน​จำนวน 6,988 รายการ ซึ่ง​ทุก​สาขาวิชา​มี​จำนวน​บทความ​เกิน​เกณฑ์​ขั้นต่ำ 600 รายการ​อย่าง​ครบถ้วน</w:t>
+        <w:t>จาก​การ​ทำความสะอาด​ข้อมูล พบ​รายการ​ข้อมูล​ที่​มีปัญหา ได้แก่ บทความ​ที่​มี​การปรากฏ​ซ้ำซ้อน​ข้าม​สาขาวิชา​จำนวน 175 รายการ, บทความ​ภาษาต่างประเทศ​ที่​ไม่​ใช่​ภาษาอังกฤษ​จำนวน 25 รายการ, บทความ​ที่​ขาด​บทคัดย่อ​จำนวน 60 รายการ, และ​บทความ​นอก​บริบท​วิทยาการ​คอมพิวเตอร์​ที่​หลุด​เข้า​มาจาก​การ​สืบค้น​คำ​สำคัญ (เช่น ดัชนี​อสังหาริมทรัพย์​ใน​ดูไบ การ​จัดการ​โรงแรม ทันตกรรม และ​การเกษตร) จำนวน 60 รายการ หลังจาก​การ​คัด​กรอง​ทั้งหมด คงเหลือ​ชุด​ข้อมูล​สะอาด​พร้อม​ใช้งาน​ทั้งสิ้น 6,991 รายการ โดย​ทุก​สาขาวิชา​มี​จำนวน​บทความ​เกิน​เกณฑ์​ขั้นต่ำ 600 รายการ​อย่าง​ครบถ้วน (ระหว่าง 690 ถึง 704 รายการ)</w:t>
       </w:r>
     </w:p>
     <w:p>
@@ -123,7 +123,7 @@
           <w:rFonts w:ascii="TH Sarabun New" w:hAnsi="TH Sarabun New"/>
           <w:sz w:val="32"/>
         </w:rPr>
-        <w:t>ใน​ส่วน​ของ​การ​สร้าง​การ​แสดงผล​ด้วย​ภาพ​แบบ​โต้ตอบ (Interactive Data Visualization) กลุ่ม​นิสิต​ได้​พัฒนา​เว็บ​แอปพลิเคชัน​รูปแบบ Single Page Dashboard จำนวน 5 มุมมอง​หลัก ได้แก่ เครือข่าย​คำ​สำคัญ​ที่​ปรากฏ​ร่วมกัน (Keyword Co-occurrence Network), คลาวด์​คำ​สำคัญ​เชิง​โต้ตอบ (Interactive Word Cloud), แผนภูมิ​ความร้อน​ความสัมพันธ์​ข้าม​สาขา (Cross-Subject Overlap Heatmap), จตุ​ภาค​วิเคราะห์​การ​เติบโต​เชิง​ยุทธศาสตร์ (Strategic Topic Growth Quadrant), และ​ระบบ​สืบค้น​บทความ​เชิง​ลึก (Scopus Document Explorer) ทั้งหมด​ทำงาน​บน​สถาปัตยกรรม​ที่​สามารถ​เปิด​ใช้งาน​ได้​บน​เว็บ​เบราว์เซอร์​ทันที​โดย​ไม่ต้อง​ติดตั้ง​โปรแกรม​เพิ่มเติม</w:t>
+        <w:t>ใน​ส่วน​ของ​การ​แสดงผล​ด้วย​ภาพ กลุ่ม​ผู้จัดทำ​ได้​พัฒนา​แพลตฟอร์ม​การ​วิเคราะห์​แบบ​โต้ตอบ (Interactive Analytics Dashboard) โดย​ประยุกต์ใช้​เทคโนโลยี Apache ECharts ที่​มีระบบ Force-directed Physics Simulation ป้องกัน​ปัญหา​ตัวอักษร​และ​โหนด​ซ้อน​ทับกัน ประกอบด้วย 6 มุมมอง​หลัก ได้แก่ (1) เครือข่าย​ความสัมพันธ์​คำ​สำคัญ​แบบ​ฟิสิกส์ (Knowledge Network), (2) คลาวด์​คำ​สำคัญ​แบบ​ไร้​การ​ทับซ้อน (Collision-free Word Cloud), (3) แผนภูมิ​ความร้อน​แสดง​การ​กระจาย​ตัว​ของ​เทคโนโลยี​ข้าม 10 สาขา (Cross-Disciplinary Heatmap), (4) จตุ​ภาค​วิเคราะห์​การ​เติบโต​เชิง​ยุทธศาสตร์ (Strategic Topic Growth Quadrant), (5) แด​ช​บอร์ด​สรุป​สถิติ​เชิง​พรรณนา (EDA Metrics), และ (6) ระบบ​สืบค้น​และ​สำรวจ​บทความ​วิจัย (Literature Explorer) สามารถ​เปิด​ใช้งาน​บน​เว็บ​เบราว์เซอร์​ได้​ทันที​โดย​ไม่ต้อง​ติดตั้ง​โปรแกรม​เพิ่มเติม</w:t>
       </w:r>
     </w:p>
     <w:p>
@@ -137,7 +137,7 @@
           <w:rFonts w:ascii="TH Sarabun New" w:hAnsi="TH Sarabun New"/>
           <w:sz w:val="32"/>
         </w:rPr>
-        <w:t>สำหรับ​การ​เตรียม​ข้อมูล​เพื่อ​สร้าง Feature Vector และ Text Embedding ได้​ทำการ​รวม​ข้อมูล 4 คอลัมน์​สำคัญ ได้แก่ Title, Abstract, Author Keywords และ Index Keywords เข้าด้วยกัน พร้อม​จำลอง​และ​วิเคราะห์​ข้อ​จำกัดความ​ยาว​โท​เค็น (Token Limit 512 โท​เค็น) ของ​โมเดล​เฉพาะทาง​ด้าน​วิทยาศาสตร์ SPECTER2 และ​ทำการ​ปรับ​ขนาด​เวกเตอร์​ด้วย L2 Normalization เพื่อ​ให้ได้​เวกเตอร์​มิติ 768 ที่​มี​ความพร้อม​สูงสุด​สำหรับ​งาน​จำแนก​สาขาวิชา (Classification) และ​การ​จัดกลุ่ม​บทความ​ตาม​ความหมาย (Semantic Clustering)</w:t>
+        <w:t>สำหรับ​การ​เตรียม​ข้อมูล​สร้าง Text Embedding ได้​ดำเนิน​การผสาน​ฟิลด์​ข้อความ Title, Abstract, Author Keywords และ Index Keywords พร้อมทั้ง​วิเคราะห์​ข้อ​จำกัดความ​ยาว 512 โท​เค็น​ของ​โมเดล SPECTER2 ซึ่ง​พบ​ว่า​ข้อมูล​มี​ความ​ยาว​เฉลี่ย 159.7 โท​เค็น และ​มี​บทความ​ที่​เกิน​ขีดจำกัด​เพียง 0.0% เท่านั้น และ​ได้​นำเสนอ​การ​ทำ L2 Normalization บน​เวกเตอร์​มิติ 768 เพื่อ​รอง​รับงาน Machine Learning ใน​การจำแนก​สาขา​และ​การ​จัดกลุ่ม​บทความ​ตาม​ความหมาย</w:t>
       </w:r>
     </w:p>
     <w:p>
@@ -181,7 +181,7 @@
           <w:rFonts w:ascii="TH Sarabun New" w:hAnsi="TH Sarabun New"/>
           <w:sz w:val="32"/>
         </w:rPr>
-        <w:t>กลุ่ม​ผู้จัดทำ​ได้​ดำเนิน​การเข้าสู่​ฐานข้อมูล Scopus (scopus.com) ภายใต้​สิทธิ์​การ​เข้าถึง​ของ​มหาวิทยาลัย โดย​กำหนด​ขอบเขต​การ​สืบค้น​ใน​กลุ่ม​สาขาวิชา​หลัก​ด้าน Computer Science เพื่อ​เลือก​ดึง​ข้อมูล​บทความ​วิจัย​ใน 10 สาขาวิชา​ย่อย (Subject Areas) ตามที่​กำหนด​ใน​ข้อ​กำหนดการ​สอบ ดังต่อไปนี้:</w:t>
+        <w:t>กลุ่ม​ผู้จัดทำ​ได้​สืบค้น​และ​ดึง​ข้อมูล​บทความ​วิจัย​จาก​ฐานข้อมูล Scopus ใน​กลุ่ม​สาขาวิชา​หลัก Computer Science ครอบคลุม 10 สาขาวิชา​ย่อย (Subject Areas) เพื่อให้​สอดคล้อง​กับ​ข้อ​กำหนดการ​สอบ ดังนี้:</w:t>
       </w:r>
     </w:p>
     <w:p>
@@ -203,7 +203,7 @@
           <w:rFonts w:ascii="TH Sarabun New" w:hAnsi="TH Sarabun New"/>
           <w:sz w:val="32"/>
         </w:rPr>
-        <w:t>จำนวน​ข้อมูลดิบ​ที่​ดึง​มา 739 รายการ, หลัง​ทำความสะอาด​เหลือ 702 รายการ</w:t>
+        <w:t>ข้อมูลดิบ​ที่​ดึง​มา 734 รายการ, ข้อมูล​สะอาด​หลัง​คลี​น 692 รายการ</w:t>
       </w:r>
     </w:p>
     <w:p>
@@ -218,14 +218,14 @@
           <w:b/>
           <w:sz w:val="32"/>
         </w:rPr>
-        <w:t xml:space="preserve">2. Artificial Intelligence: </w:t>
+        <w:t xml:space="preserve">2. Information Systems: </w:t>
       </w:r>
       <w:r>
         <w:rPr>
           <w:rFonts w:ascii="TH Sarabun New" w:hAnsi="TH Sarabun New"/>
           <w:sz w:val="32"/>
         </w:rPr>
-        <w:t>จำนวน​ข้อมูลดิบ​ที่​ดึง​มา 733 รายการ, หลัง​ทำความสะอาด​เหลือ 696 รายการ</w:t>
+        <w:t>ข้อมูลดิบ​ที่​ดึง​มา 730 รายการ, ข้อมูล​สะอาด​หลัง​คลี​น 702 รายการ</w:t>
       </w:r>
     </w:p>
     <w:p>
@@ -240,14 +240,14 @@
           <w:b/>
           <w:sz w:val="32"/>
         </w:rPr>
-        <w:t xml:space="preserve">3. Software: </w:t>
+        <w:t xml:space="preserve">3. Signal Processing: </w:t>
       </w:r>
       <w:r>
         <w:rPr>
           <w:rFonts w:ascii="TH Sarabun New" w:hAnsi="TH Sarabun New"/>
           <w:sz w:val="32"/>
         </w:rPr>
-        <w:t>จำนวน​ข้อมูลดิบ​ที่​ดึง​มา 731 รายการ, หลัง​ทำความสะอาด​เหลือ 704 รายการ</w:t>
+        <w:t>ข้อมูลดิบ​ที่​ดึง​มา 730 รายการ, ข้อมูล​สะอาด​หลัง​คลี​น 702 รายการ</w:t>
       </w:r>
     </w:p>
     <w:p>
@@ -262,14 +262,14 @@
           <w:b/>
           <w:sz w:val="32"/>
         </w:rPr>
-        <w:t xml:space="preserve">4. Information Systems: </w:t>
+        <w:t xml:space="preserve">4. Computer Vision and Pattern Recognition: </w:t>
       </w:r>
       <w:r>
         <w:rPr>
           <w:rFonts w:ascii="TH Sarabun New" w:hAnsi="TH Sarabun New"/>
           <w:sz w:val="32"/>
         </w:rPr>
-        <w:t>จำนวน​ข้อมูลดิบ​ที่​ดึง​มา 730 รายการ, หลัง​ทำความสะอาด​เหลือ 700 รายการ</w:t>
+        <w:t>ข้อมูลดิบ​ที่​ดึง​มา 729 รายการ, ข้อมูล​สะอาด​หลัง​คลี​น 704 รายการ</w:t>
       </w:r>
     </w:p>
     <w:p>
@@ -284,14 +284,14 @@
           <w:b/>
           <w:sz w:val="32"/>
         </w:rPr>
-        <w:t xml:space="preserve">5. Signal Processing: </w:t>
+        <w:t xml:space="preserve">5. Human-Computer Interaction: </w:t>
       </w:r>
       <w:r>
         <w:rPr>
           <w:rFonts w:ascii="TH Sarabun New" w:hAnsi="TH Sarabun New"/>
           <w:sz w:val="32"/>
         </w:rPr>
-        <w:t>จำนวน​ข้อมูลดิบ​ที่​ดึง​มา 728 รายการ, หลัง​ทำความสะอาด​เหลือ 702 รายการ</w:t>
+        <w:t>ข้อมูลดิบ​ที่​ดึง​มา 729 รายการ, ข้อมูล​สะอาด​หลัง​คลี​น 703 รายการ</w:t>
       </w:r>
     </w:p>
     <w:p>
@@ -306,14 +306,14 @@
           <w:b/>
           <w:sz w:val="32"/>
         </w:rPr>
-        <w:t xml:space="preserve">6. Computer Networks and Communications: </w:t>
+        <w:t xml:space="preserve">6. Computational Theory and Mathematics: </w:t>
       </w:r>
       <w:r>
         <w:rPr>
           <w:rFonts w:ascii="TH Sarabun New" w:hAnsi="TH Sarabun New"/>
           <w:sz w:val="32"/>
         </w:rPr>
-        <w:t>จำนวน​ข้อมูลดิบ​ที่​ดึง​มา 727 รายการ, หลัง​ทำความสะอาด​เหลือ 694 รายการ</w:t>
+        <w:t>ข้อมูลดิบ​ที่​ดึง​มา 727 รายการ, ข้อมูล​สะอาด​หลัง​คลี​น 699 รายการ</w:t>
       </w:r>
     </w:p>
     <w:p>
@@ -328,14 +328,14 @@
           <w:b/>
           <w:sz w:val="32"/>
         </w:rPr>
-        <w:t xml:space="preserve">7. Human-Computer Interaction: </w:t>
+        <w:t xml:space="preserve">7. Software: </w:t>
       </w:r>
       <w:r>
         <w:rPr>
           <w:rFonts w:ascii="TH Sarabun New" w:hAnsi="TH Sarabun New"/>
           <w:sz w:val="32"/>
         </w:rPr>
-        <w:t>จำนวน​ข้อมูลดิบ​ที่​ดึง​มา 727 รายการ, หลัง​ทำความสะอาด​เหลือ 697 รายการ</w:t>
+        <w:t>ข้อมูลดิบ​ที่​ดึง​มา 727 รายการ, ข้อมูล​สะอาด​หลัง​คลี​น 700 รายการ</w:t>
       </w:r>
     </w:p>
     <w:p>
@@ -350,14 +350,14 @@
           <w:b/>
           <w:sz w:val="32"/>
         </w:rPr>
-        <w:t xml:space="preserve">8. Computer Vision and Pattern Recognition: </w:t>
+        <w:t xml:space="preserve">8. Artificial Intelligence: </w:t>
       </w:r>
       <w:r>
         <w:rPr>
           <w:rFonts w:ascii="TH Sarabun New" w:hAnsi="TH Sarabun New"/>
           <w:sz w:val="32"/>
         </w:rPr>
-        <w:t>จำนวน​ข้อมูลดิบ​ที่​ดึง​มา 725 รายการ, หลัง​ทำความสะอาด​เหลือ 697 รายการ</w:t>
+        <w:t>ข้อมูลดิบ​ที่​ดึง​มา 725 รายการ, ข้อมูล​สะอาด​หลัง​คลี​น 697 รายการ</w:t>
       </w:r>
     </w:p>
     <w:p>
@@ -372,14 +372,14 @@
           <w:b/>
           <w:sz w:val="32"/>
         </w:rPr>
-        <w:t xml:space="preserve">9. Computer Graphics and Computer-Aided Design: </w:t>
+        <w:t xml:space="preserve">9. Computer Networks and Communications: </w:t>
       </w:r>
       <w:r>
         <w:rPr>
           <w:rFonts w:ascii="TH Sarabun New" w:hAnsi="TH Sarabun New"/>
           <w:sz w:val="32"/>
         </w:rPr>
-        <w:t>จำนวน​ข้อมูลดิบ​ที่​ดึง​มา 721 รายการ, หลัง​ทำความสะอาด​เหลือ 698 รายการ</w:t>
+        <w:t>ข้อมูลดิบ​ที่​ดึง​มา 725 รายการ, ข้อมูล​สะอาด​หลัง​คลี​น 690 รายการ</w:t>
       </w:r>
     </w:p>
     <w:p>
@@ -394,28 +394,14 @@
           <w:b/>
           <w:sz w:val="32"/>
         </w:rPr>
-        <w:t xml:space="preserve">10. Computational Theory and Mathematics: </w:t>
+        <w:t xml:space="preserve">10. Computer Graphics and Computer-Aided Design: </w:t>
       </w:r>
       <w:r>
         <w:rPr>
           <w:rFonts w:ascii="TH Sarabun New" w:hAnsi="TH Sarabun New"/>
           <w:sz w:val="32"/>
         </w:rPr>
-        <w:t>จำนวน​ข้อมูลดิบ​ที่​ดึง​มา 719 รายการ, หลัง​ทำความสะอาด​เหลือ 698 รายการ</w:t>
-      </w:r>
-    </w:p>
-    <w:p>
-      <w:pPr>
-        <w:spacing w:after="80"/>
-        <w:ind w:firstLine="720"/>
-        <w:jc w:val="left"/>
-      </w:pPr>
-      <w:r>
-        <w:rPr>
-          <w:rFonts w:ascii="TH Sarabun New" w:hAnsi="TH Sarabun New"/>
-          <w:sz w:val="32"/>
-        </w:rPr>
-        <w:t>การส่งออก​ข้อมูล​จาก Scopus กำหนดให้​ครอบคลุม​คอลัมน์​มาตรฐาน​ครบ​ทุก​มิติ ได้แก่ ข้อมูล​การ​อ้างอิง (Authors, Title, Year, EID, Source title, Cited by, DOI), ข้อมูล​บรรณานุกรม (Affiliations, Publisher, ISSN, Language), ข้อมูล​เนื้อหา​และ​คำ​สำคัญ (Abstract, Author Keywords, Index Keywords) และ​ข้อมูล​การ​สนับสนุน​ทุนวิจัย รวม​ทั้งสิ้น​กว่า 40 คอลัมน์</w:t>
+        <w:t>ข้อมูลดิบ​ที่​ดึง​มา 724 รายการ, ข้อมูล​สะอาด​หลัง​คลี​น 702 รายการ</w:t>
       </w:r>
     </w:p>
     <w:p>
@@ -430,7 +416,7 @@
           <w:color w:val="0F172A"/>
           <w:sz w:val="32"/>
         </w:rPr>
-        <w:t>1.2 การ​ตรวจสอบ​คุณภาพ​และ​การ​ทำความสะอาด​ข้อมูล (Data Cleaning Pipeline)</w:t>
+        <w:t>1.2 ขั้นตอน​การ​ตรวจสอบ​คุณภาพ​และ​การ​ทำความสะอาด​ข้อมูล</w:t>
       </w:r>
     </w:p>
     <w:p>
@@ -444,95 +430,15 @@
           <w:rFonts w:ascii="TH Sarabun New" w:hAnsi="TH Sarabun New"/>
           <w:sz w:val="32"/>
         </w:rPr>
-        <w:t>จาก​การสำรวจ​โครงสร้าง​ข้อมูลดิบ​เบื้องต้น พบ​ว่า​ข้อมูล​ทางวิชาการ​ที่​ได้​จาก​การ​สืบค้น​ด้วย​คำ​สำคัญ​มัก​มี​ความคลาดเคลื่อน​และ​สิ่งเจือปน กลุ่ม​ผู้จัดทำ​จึง​ได้​ออกแบบ​กระบวนการ​ทำความสะอาด​ข้อมูล​ตาม​ขั้นตอน​และ​เงื่อนไข​ของ​อาจารย์ผู้สอน​อย่าง​เป็นระบบ:</w:t>
-      </w:r>
-    </w:p>
-    <w:p>
-      <w:pPr>
-        <w:pStyle w:val="ListBullet"/>
-        <w:spacing w:after="60"/>
-        <w:jc w:val="left"/>
-      </w:pPr>
-      <w:r>
-        <w:rPr>
-          <w:rFonts w:ascii="TH Sarabun New" w:hAnsi="TH Sarabun New"/>
-          <w:b/>
-          <w:sz w:val="32"/>
-        </w:rPr>
-        <w:t xml:space="preserve">1) การ​ตรวจ​และ​กำจัด​ข้อมูล​ซ้ำซ้อน (Deduplication): </w:t>
-      </w:r>
-      <w:r>
-        <w:rPr>
-          <w:rFonts w:ascii="TH Sarabun New" w:hAnsi="TH Sarabun New"/>
-          <w:sz w:val="32"/>
-        </w:rPr>
-        <w:t>ตามเงื่อนไข​ที่​อาจารย์​ระบุ​ไว้ บทความ​วิจัย​หนึ่ง​เรื่อง​ควร​จัด​อยู่​ใน Subject Area ที่​เหมาะสม​เพียง​สาขา​เดียว​เท่านั้น หาก​พบ​บทความ​เรื่อง​เดียวกัน​ปรากฏ​ซ้ำ​ข้าม​สาขา (เช่น ปรากฏ​ทั้ง​ใน Artificial Intelligence และ Software) ระบบ​จะ​ตรวจจับ​ด้วย​ชื่อ​บทความ (Title) และ​รหัส​ระบุ​วัตถุ​ดิจิทัล (DOI) โดย​ดำเนิน​การคัดเลือก​ให้​อยู่​ใน​สาขา​ที่​มี​ความเกี่ยวข้อง​สูงสุด​เพียง​รายการ​เดียว และ​ตัด​ราย​การซ้ำ​ออก ซึ่ง​ใน​ขั้น​ตอนนี้​สามารถ​กำจัด​บทความ​ซ้ำ​ได้​ทั้งสิ้น 178 รายการ</w:t>
-      </w:r>
-    </w:p>
-    <w:p>
-      <w:pPr>
-        <w:pStyle w:val="ListBullet"/>
-        <w:spacing w:after="60"/>
-        <w:jc w:val="left"/>
-      </w:pPr>
-      <w:r>
-        <w:rPr>
-          <w:rFonts w:ascii="TH Sarabun New" w:hAnsi="TH Sarabun New"/>
-          <w:b/>
-          <w:sz w:val="32"/>
-        </w:rPr>
-        <w:t xml:space="preserve">2) การกรอง​บทความ​ภาษาต่างประเทศ (Language Filter): </w:t>
-      </w:r>
-      <w:r>
-        <w:rPr>
-          <w:rFonts w:ascii="TH Sarabun New" w:hAnsi="TH Sarabun New"/>
-          <w:sz w:val="32"/>
-        </w:rPr>
-        <w:t>เนื่องจาก​โมเดล​การเรียน​รู้ทาง​ภาษา​และ Text Embedding ที่​เลือก​ใช้ (เช่น SPECTER2 และ SciBERT) ได้รับ​การฝึกฝน​บน​ชุด​ข้อมูล​ภาษาอังกฤษ ดังนั้น​บทความ​ที่​ระบุ​คอลัมน์ 'Language of Original Document' เป็น​ภาษา​อื่น​ที่​ไม่​ใช่​ภาษาอังกฤษ (เช่น สเปน จีน ฝรั่งเศส หรือ​เยอรมัน) จำนวน 25 รายการ จึง​ถูก​คัด​กรอง​ออกจาก​ชุด​ข้อมูล เพื่อ​ป้องกัน​สัญญาณรบกวน​ใน​การ​สร้าง​เวกเตอร์​ความหมาย</w:t>
-      </w:r>
-    </w:p>
-    <w:p>
-      <w:pPr>
-        <w:pStyle w:val="ListBullet"/>
-        <w:spacing w:after="60"/>
-        <w:jc w:val="left"/>
-      </w:pPr>
-      <w:r>
-        <w:rPr>
-          <w:rFonts w:ascii="TH Sarabun New" w:hAnsi="TH Sarabun New"/>
-          <w:b/>
-          <w:sz w:val="32"/>
-        </w:rPr>
-        <w:t xml:space="preserve">3) การ​คัด​กรอง​บทความ​ที่​ขาด​บทคัดย่อ (Missing Abstracts Filter): </w:t>
-      </w:r>
-      <w:r>
-        <w:rPr>
-          <w:rFonts w:ascii="TH Sarabun New" w:hAnsi="TH Sarabun New"/>
-          <w:sz w:val="32"/>
-        </w:rPr>
-        <w:t>บทคัดย่อ​เป็น​ข้อมูล​ส่วน​หลัก​ที่​บรรจุ​สาระสำคัญ​ของ​ระเบียบวิธี​และ​ผลการวิจัย บทความ​ที่​มีค่า​ว่าง​ใน​คอลัมน์ Abstract หรือ​มี​ความ​ยาว​ข้อความ​น้อยกว่า 40 ตัวอักษร (เช่น บทความ​ประเภท Editorial, Correction หรือ​บทคัดย่อ​ที่​ไม่​สมบูรณ์) จำนวน 30 รายการ ได้รับ​การ​คัด​ออกจาก​การ​วิเคราะห์</w:t>
-      </w:r>
-    </w:p>
-    <w:p>
-      <w:pPr>
-        <w:pStyle w:val="ListBullet"/>
-        <w:spacing w:after="60"/>
-        <w:jc w:val="left"/>
-      </w:pPr>
-      <w:r>
-        <w:rPr>
-          <w:rFonts w:ascii="TH Sarabun New" w:hAnsi="TH Sarabun New"/>
-          <w:b/>
-          <w:sz w:val="32"/>
-        </w:rPr>
-        <w:t xml:space="preserve">4) การตรวจจับ​และ​ขจัด​บทความ​ที่​ไม่​เกี่ยวข้อง (Irrelevant Domain Articles Filter): </w:t>
-      </w:r>
-      <w:r>
-        <w:rPr>
-          <w:rFonts w:ascii="TH Sarabun New" w:hAnsi="TH Sarabun New"/>
-          <w:sz w:val="32"/>
-        </w:rPr>
-        <w:t>ปัญหา​สำคัญ​ที่​มัก​พบ​ใน​ฐานข้อมูล Scopus คือ​การ​สืบค้น​คำ​สำคัญ​ทาง​คอมพิวเตอร์​ที่​ไป​ตรง​กับ​งานวิจัย​ใน​ศาสตร์​อื่น เช่น การศึกษา​ดัชนี​ราคา​อสังหาริมทรัพย์ (Dubai property price index), ประสิทธิผล​การ​จัดการ​โรงแรม​และ​การท่องเที่ยว (Tourism management), การประเมิน​รากฟัน​เทียม​ไท​ทา​เนียม (Dental implants), และ​การประเมิน​ผลผลิต​ข้าวสาลี​ฤดูหนาว (Winter wheat crop yield) ซึ่ง​หลุด​เข้ามา​ใน​ผล​การ​ค้นหา กลุ่ม​ผู้จัดทำ​ได้​ใช้​การตรวจจับ​ด้วย​รูปแบบ​คำ​ค้น​เฉพาะทาง​ของ​โดเมน​ที่​ไม่​เกี่ยวข้อง​และ​คัดออก​ได้​จำนวน 59 รายการ</w:t>
+        <w:t>กระบวนการ​ทำความสะอาด​ข้อมูล​ถูก​ออกแบบ​ขึ้น​ใน​สคริปต์ scopus_eda_analysis.py ตาม​ข้อกำหนด​ของ​อาจารย์ผู้สอน ดังนี้:</w:t>
+        <w:br/>
+        <w:t>1. การ​ตรวจสอบ​และ​กำจัด​ข้อมูล​ซ้ำซ้อน (Deduplication): กำหนดให้​บทความ​หนึ่ง​เรื่อง​จัด​อยู่​ใน​สาขาวิชา​ที่​เหมาะสม​ที่สุด​เพียง​สาขา​เดียว หาก​พบ​บทความ​เรื่อง​เดียวกัน​ปรากฏ​ซ้ำ​ข้าม​สาขาวิชา ระบบ​จะ​ตรวจจับ​ด้วย​ชื่อเรื่อง (Title) และ​ทำการ​ตัด​ราย​การซ้ำ​ออก ซึ่ง​ตัด​ได้ 180 รายการ</w:t>
+        <w:br/>
+        <w:t>2. การกรอง​บทความ​ภาษาต่างประเทศ (Language Filter): กรอง​บทความ​ที่​ใช้​ภาษา​อื่น เช่น สเปน จีน เยอรมัน ออก​จำนวน 25 รายการ เพื่อ​ไม่​ให้​เป็น​สัญญาณรบกวน​ต่อ​โมเดล​ภาษา</w:t>
+        <w:br/>
+        <w:t>3. การ​คัด​กรอง​บทความ​ที่​ขาด​บทคัดย่อ (Missing Abstracts): คัด​กรอง​บทความ​ที่​ไม่​มี Abstract หรือ​มี​ข้อความ​สั้น​กว่า 40 ตัวอักษร ออก​จำนวน 30 รายการ</w:t>
+        <w:br/>
+        <w:t>4. การ​คัดแยก​บทความ​นอก​ศาสตร์​คอมพิวเตอร์ (Domain Leakage Filter): ตรวจค้น​คำ​ค้น​ที่​ติด​หลุด​เข้ามา​ใน​หมวด​คอมพิวเตอร์ เช่น ดัชนี​ราคา​อสังหาริมทรัพย์​ใน​ดูไบ การ​จัดการ​โรงแรม​และ​ที่พัก รากฟัน​เทียม​ไท​ทา​เนียม และ​ผลผลิต​ข้าวสาลี​ฤดูหนาว และ​ทำการ​คัดออก​ทั้งสิ้น 59 รายการ</w:t>
       </w:r>
     </w:p>
     <w:p>
@@ -547,21 +453,7 @@
           <w:color w:val="0F172A"/>
           <w:sz w:val="32"/>
         </w:rPr>
-        <w:t>1.3 สรุป​ผล​การ​ทำความสะอาด​ข้อมูล</w:t>
-      </w:r>
-    </w:p>
-    <w:p>
-      <w:pPr>
-        <w:spacing w:after="80"/>
-        <w:ind w:firstLine="720"/>
-        <w:jc w:val="left"/>
-      </w:pPr>
-      <w:r>
-        <w:rPr>
-          <w:rFonts w:ascii="TH Sarabun New" w:hAnsi="TH Sarabun New"/>
-          <w:sz w:val="32"/>
-        </w:rPr>
-        <w:t>ตาราง​ที่ 1 แสดง​สรุป​จำนวน​รายการ​ใน​แต่ละ​ขั้นตอน​ของ​การ​ทำความสะอาด​ข้อมูล:</w:t>
+        <w:t>1.3 ตาราง​สรุป​ผล​การ​ทำความสะอาด​ข้อมูล</w:t>
       </w:r>
     </w:p>
     <w:tbl>
@@ -774,7 +666,7 @@
                 <w:rFonts w:ascii="TH Sarabun New" w:hAnsi="TH Sarabun New"/>
                 <w:sz w:val="30"/>
               </w:rPr>
-              <w:t>178</w:t>
+              <w:t>175</w:t>
             </w:r>
           </w:p>
         </w:tc>
@@ -797,7 +689,7 @@
                 <w:rFonts w:ascii="TH Sarabun New" w:hAnsi="TH Sarabun New"/>
                 <w:sz w:val="30"/>
               </w:rPr>
-              <w:t>7,102</w:t>
+              <w:t>7,105</w:t>
             </w:r>
           </w:p>
         </w:tc>
@@ -868,7 +760,7 @@
                 <w:rFonts w:ascii="TH Sarabun New" w:hAnsi="TH Sarabun New"/>
                 <w:sz w:val="30"/>
               </w:rPr>
-              <w:t>7,077</w:t>
+              <w:t>7,080</w:t>
             </w:r>
           </w:p>
         </w:tc>
@@ -916,7 +808,7 @@
                 <w:rFonts w:ascii="TH Sarabun New" w:hAnsi="TH Sarabun New"/>
                 <w:sz w:val="30"/>
               </w:rPr>
-              <w:t>30</w:t>
+              <w:t>60</w:t>
             </w:r>
           </w:p>
         </w:tc>
@@ -939,7 +831,7 @@
                 <w:rFonts w:ascii="TH Sarabun New" w:hAnsi="TH Sarabun New"/>
                 <w:sz w:val="30"/>
               </w:rPr>
-              <w:t>7,047</w:t>
+              <w:t>7,020</w:t>
             </w:r>
           </w:p>
         </w:tc>
@@ -987,7 +879,7 @@
                 <w:rFonts w:ascii="TH Sarabun New" w:hAnsi="TH Sarabun New"/>
                 <w:sz w:val="30"/>
               </w:rPr>
-              <w:t>59</w:t>
+              <w:t>60</w:t>
             </w:r>
           </w:p>
         </w:tc>
@@ -1010,7 +902,7 @@
                 <w:rFonts w:ascii="TH Sarabun New" w:hAnsi="TH Sarabun New"/>
                 <w:sz w:val="30"/>
               </w:rPr>
-              <w:t>6,988</w:t>
+              <w:t>6,991</w:t>
             </w:r>
           </w:p>
         </w:tc>
@@ -1083,7 +975,7 @@
           <w:color w:val="0F172A"/>
           <w:sz w:val="32"/>
         </w:rPr>
-        <w:t>1.4 สถิติ​เชิง​พรรณนา​ที่​สำคัญ​จาก​การสำรวจ​ข้อมูล (Exploratory Data Insights)</w:t>
+        <w:t>1.4 สถิติ​เชิง​พรรณนา​จาก​การสำรวจ​ข้อมูล</w:t>
       </w:r>
     </w:p>
     <w:p>
@@ -1097,11 +989,11 @@
           <w:rFonts w:ascii="TH Sarabun New" w:hAnsi="TH Sarabun New"/>
           <w:sz w:val="32"/>
         </w:rPr>
-        <w:t>จาก​การสำรวจ​ชุด​ข้อมูล​สะอาด​จำนวน 6,988 รายการ พบ​ลักษณะ​ทาง​สถิติ​ที่​สำคัญ​ดังนี้:</w:t>
+        <w:t>จาก​การสำรวจ​ชุด​ข้อมูล​สะอาด​จำนวน 6,991 รายการ พบ​ข้อมูล​เชิง​สถิติ​ที่​น่าสนใจ​ดังนี้:</w:t>
         <w:br/>
-        <w:t>1. แนวโน้ม​ปี​ที่​ตีพิมพ์: งานวิจัย​มี​การ​กระจาย​ตัว​ตั้งแต่​ปี 2020 ถึง 2026 โดย​มี​สัดส่วน​สูงสุด​ใน​ช่วง​ปี 2023–2024 (ปี 2023 มี 1,406 รายการ และ​ปี 2024 มี 1,576 รายการ) ซึ่ง​สะท้อน​ถึง​การ​เติบโต​อย่าง​ก้าว​กระโดด​ของ​งานวิจัย​ด้าน Generative AI, Large Language Models และ​ระบบ​ประมวลผล​ประสิทธิภาพ​สูง​ใน​ช่วงหลัง​วิกฤต​โควิด-19</w:t>
+        <w:t>1. แนวโน้ม​ปี​ที่​ตีพิมพ์: งานวิจัย​มี​การ​ตีพิมพ์​กระจาย​ตัว​ตั้งแต่​ปี 2020 ถึง 2026 โดย​มี​ปริมาณ​หนาแน่น​ที่สุด​ใน​ช่วง​ปี 2023–2024 (ปี 2023 มี 1,421 รายการ และ​ปี 2024 มี 1,573 รายการ) ซึ่ง​สะท้อน​ถึง​การ​เติบโต​อย่าง​ก้าว​กระโดด​ของ​งานวิจัย​ด้าน AI และ​ระบบ​อัตโนมัติ​ใน​ยุคปัจจุบัน</w:t>
         <w:br/>
-        <w:t>2. สถิติ​การ​อ้างอิง (Citations): บท​ความใน​ชุด​ข้อมูล​มี​จำนวน​การ​อ้างอิง​เฉลี่ย 6.09 ครั้ง ค่า​มัธยฐาน​อยู่​ที่ 3.0 ครั้ง และ​มีค่า​การ​อ้างอิง​สูงสุด​ถึง 208 ครั้ง การ​กระจาย​ตัว​ของ​การ​อ้างอิง​เป็นไปตาม​ลักษณะ Power-Law Distribution หรือ Long-Tail ซึ่ง​บทความ​ส่วนใหญ่​ได้รับ​การ​อ้างอิง​ใน​ระดับปานกลาง ในขณะที่​บทความ​บุกเบิก​ใน​กลุ่ม Deep Learning และ Computer Vision ได้รับ​การ​อ้างอิง​สูง​อย่าง​มี​นัยสำคัญ</w:t>
+        <w:t>2. สถิติ​การ​อ้างอิง: บทความ​ได้รับ​การ​อ้างอิง​เฉลี่ย 5.46 ครั้ง ค่า​มัธยฐาน 3.0 ครั้ง และ​มี​ค่าสูงสุด​ถึง 134 ครั้ง การ​กระจาย​ตัว​มี​ลักษณะ​แบบ​หางยาว (Long-tail Distribution) ที่​บทความ​ส่วนใหญ่​ได้รับ​การ​อ้างอิง​ระดับปานกลาง ขณะที่​บทความ​ด้าน Deep Learning ได้รับ​การ​อ้างอิง​สูง​เป็นพิเศษ</w:t>
       </w:r>
     </w:p>
     <w:p>
@@ -1245,7 +1137,7 @@
           <w:rFonts w:ascii="TH Sarabun New" w:hAnsi="TH Sarabun New"/>
           <w:sz w:val="32"/>
         </w:rPr>
-        <w:t>เพื่อ​ตอบสนอง​ต่อ​โจทย์​การเรียนรู้​ที่​ต้องการ​ให้​มองเห็น​โครง​สร้างความสัมพันธ์​ของ​ข้อมูล​ที่ซ่อน​อยู่​ใน​ไฟล์ Scopus กลุ่ม​ผู้จัดทำ​ได้​ออกแบบ​และ​พัฒนา Interactive Data Visualization ขึ้น​บน​เว็บ​เบราว์เซอร์ โดย​อ้างอิง​มาตรฐาน​จาก​ตัวอย่าง​ของ​อาจารย์ผู้สอน พร้อมทั้ง​เสริม​ขีดความสามารถ​ใน​การโต้ตอบ โดย​มี​รายละเอียด​ของ Visualization แต่ละ​ตัว​และ​ความสัมพันธ์​กับ​ข้อมูล​ดังนี้:</w:t>
+        <w:t>กลุ่ม​ผู้จัดทำ​ได้​ออกแบบ​แพลตฟอร์ม​การ​แสดงผล​ด้วย​ภาพ​แบบ​โต้ตอบ (Interactive Visualization Dashboard) ขึ้น​ใหม่ โดย​แก้ปัญหา​ข้อความ​ทับซ้อน​และ​กราฟ​ที่​กระจุก​ตัว​ด้วย​เทคโนโลยี Apache ECharts และ​อัลกอริทึม Force-directed Physics Simulation ทำให้​กราฟ​มี​ความโปร่ง สบาย​ตา และ​มี​ระยะห่าง​ระหว่าง​โหนด​อย่าง​เป็นธรรมชาติ โดย​มี​รายละเอียด​ของ​แต่ละ​มุมมอง​ดังนี้:</w:t>
       </w:r>
     </w:p>
     <w:p>
@@ -1260,7 +1152,7 @@
           <w:color w:val="0F172A"/>
           <w:sz w:val="32"/>
         </w:rPr>
-        <w:t>2.1 Keyword Co-occurrence Network (เครือข่าย​ความสัมพันธ์​คำ​สำคัญ)</w:t>
+        <w:t>2.1 Interactive Keyword Co-occurrence Knowledge Network</w:t>
       </w:r>
     </w:p>
     <w:p>
@@ -1274,95 +1166,15 @@
           <w:rFonts w:ascii="TH Sarabun New" w:hAnsi="TH Sarabun New"/>
           <w:sz w:val="32"/>
         </w:rPr>
-        <w:t>เครือข่าย​คำ​สำคัญ​ที่​ปรากฏ​ร่วมกัน​เป็น​เทคนิค​การ​วิเคราะห์​เชิง​โครงสร้าง (Structural Network Analysis) ที่​มี​วัตถุประสงค์​เพื่อ​ศึกษา​ว่า ใน​แวดวง​วิทยาการ​คอมพิวเตอร์ หัวข้อ​วิจัย​ใด​มัก​ถูก​หยิบ​ยกขึ้น​มา​ศึกษา​ควบคู่​กัน โดย​หลักการ​ทาง​คณิตศาสตร์​และ​องค์ประกอบ​ของ​กราฟ​มี​ความสัมพันธ์​กับ​ข้อมูล ดังนี้:</w:t>
-      </w:r>
-    </w:p>
-    <w:p>
-      <w:pPr>
-        <w:pStyle w:val="ListBullet"/>
-        <w:spacing w:after="60"/>
-        <w:jc w:val="left"/>
-      </w:pPr>
-      <w:r>
-        <w:rPr>
-          <w:rFonts w:ascii="TH Sarabun New" w:hAnsi="TH Sarabun New"/>
-          <w:b/>
-          <w:sz w:val="32"/>
-        </w:rPr>
-        <w:t xml:space="preserve">โหนด (Nodes): </w:t>
-      </w:r>
-      <w:r>
-        <w:rPr>
-          <w:rFonts w:ascii="TH Sarabun New" w:hAnsi="TH Sarabun New"/>
-          <w:sz w:val="32"/>
-        </w:rPr>
-        <w:t>แทน​คำ​สำคัญ​ทางวิชาการ (Author Keywords และ Index Keywords) โดย​ขนาด​รัศมี​ของ​โหนด ($r = 6 + 1.6\sqrt{DF}$) แปรผันตรง​ตาม​จำนวน​บทความ​วิจัย​ที่​ปรากฏ​คำ​สำคัญ​นั้น (Document Frequency)</w:t>
-      </w:r>
-    </w:p>
-    <w:p>
-      <w:pPr>
-        <w:pStyle w:val="ListBullet"/>
-        <w:spacing w:after="60"/>
-        <w:jc w:val="left"/>
-      </w:pPr>
-      <w:r>
-        <w:rPr>
-          <w:rFonts w:ascii="TH Sarabun New" w:hAnsi="TH Sarabun New"/>
-          <w:b/>
-          <w:sz w:val="32"/>
-        </w:rPr>
-        <w:t xml:space="preserve">เส้น​เชื่อม (Edges): </w:t>
-      </w:r>
-      <w:r>
-        <w:rPr>
-          <w:rFonts w:ascii="TH Sarabun New" w:hAnsi="TH Sarabun New"/>
-          <w:sz w:val="32"/>
-        </w:rPr>
-        <w:t>แทน​การปรากฏ​ร่วมกัน​ของ​คำ​สำคัญ​สอง​คำ​ภายใน​บทความ​วิจัย​เรื่อง​เดียวกัน โดย​ความ​หนา​ของ​เส้น​แปรผัน​ตาม​น้ำหนัก ($w$) ซึ่ง​คำนวณ​จาก​จำนวน​บทความ​ที่​มี​คำ​สำคัญ​ทั้งสอง​ปรากฏ​พร้อมกัน ช่วย​ให้​นักวิเคราะห์​เห็น​แกน​หลัก​ของ​การ​เชื่อมโยง​องค์ความรู้</w:t>
-      </w:r>
-    </w:p>
-    <w:p>
-      <w:pPr>
-        <w:pStyle w:val="ListBullet"/>
-        <w:spacing w:after="60"/>
-        <w:jc w:val="left"/>
-      </w:pPr>
-      <w:r>
-        <w:rPr>
-          <w:rFonts w:ascii="TH Sarabun New" w:hAnsi="TH Sarabun New"/>
-          <w:b/>
-          <w:sz w:val="32"/>
-        </w:rPr>
-        <w:t xml:space="preserve">การ​จัดกลุ่ม​ด้วย​สี (Thematic Clusters): </w:t>
-      </w:r>
-      <w:r>
-        <w:rPr>
-          <w:rFonts w:ascii="TH Sarabun New" w:hAnsi="TH Sarabun New"/>
-          <w:sz w:val="32"/>
-        </w:rPr>
-        <w:t>ประยุกต์ใช้​อัลกอริทึม Modularity Maximization ใน​การตรวจจับ​กลุ่ม​ชุมชน (Community Detection) แบ่ง​คำ​สำคัญ​ออก​เป็น 5 คลัสเตอร์​หลัก ได้แก่ (1) AI &amp; Large Models, (2) Networks &amp; Cloud, (3) Computer Vision, (4) HCI &amp; UI/UX, และ (5) Software Architecture หรือ​สามารถ​สลับ​เป็น​โหมด Average Publication Year เพื่อ​ดู​ว่า​คำ​สำคัญ​ใด​เป็น​หัวข้อ​เก่า​หรือ​ใหม่</w:t>
-      </w:r>
-    </w:p>
-    <w:p>
-      <w:pPr>
-        <w:pStyle w:val="ListBullet"/>
-        <w:spacing w:after="60"/>
-        <w:jc w:val="left"/>
-      </w:pPr>
-      <w:r>
-        <w:rPr>
-          <w:rFonts w:ascii="TH Sarabun New" w:hAnsi="TH Sarabun New"/>
-          <w:b/>
-          <w:sz w:val="32"/>
-        </w:rPr>
-        <w:t xml:space="preserve">ฟังก์ชัน​ปฏิสัมพันธ์: </w:t>
-      </w:r>
-      <w:r>
-        <w:rPr>
-          <w:rFonts w:ascii="TH Sarabun New" w:hAnsi="TH Sarabun New"/>
-          <w:sz w:val="32"/>
-        </w:rPr>
-        <w:t>ผู้ใช้​สามารถ​ปรับ​เกณฑ์ Document Frequency ขั้นต่ำ​เพื่อ​กรอง​โหนด​ที่​ไม่​สำคัญ​ออก, ซูม​และ​เลื่อน​กราฟ (Zoom/Pan), และ​เมื่อ​คลิก​ที่​โหนด​ใดๆ ระบบ​จะ​แสดง​รายการ​คำ​สำคัญ​ที่​ปรากฏ​ร่วมกัน​บ่อย​ที่สุด พร้อม​เปิด​ดู​รายชื่อ​บทความ​และ​บทคัดย่อ​จริง​ที่อยู่​เบื้องหลัง​ได้​ทันที</w:t>
+        <w:t>เครือข่าย​ความสัมพันธ์​คำ​สำคัญ​ใช้​หลักการ​วิเคราะห์​โครงสร้าง​เครือข่าย (Graph Analytics) เพื่อ​ศึกษา​การ​เชื่อมโยง​ของ​แนวคิด​วิจัย:</w:t>
+        <w:br/>
+        <w:t>- โหนด (Nodes): แทน​คำ​สำคัญ​ทางวิชาการ ขนาด​ของ​โหนด​คำนวณ​จาก Document Frequency เพื่อ​สะท้อน​ความนิยม​ของ​หัวข้อ​วิจัย</w:t>
+        <w:br/>
+        <w:t>- เส้น​เชื่อม (Edges): แทน​การปรากฏ​ร่วมกัน (Co-occurrence) ของ​คำ​สำคัญ​ใน​บทความ​เรื่อง​เดียวกัน โดย​ความ​หนา​ของ​เส้น​แปรผัน​ตาม​น้ำหนัก​ความถี่​ร่วม</w:t>
+        <w:br/>
+        <w:t>- 5 Thematic Clusters: ใช้​อัลกอริทึม​จัดกลุ่ม​แบ่ง​เป็น 5 คลัสเตอร์​หลัก ได้แก่ (1) AI &amp; Large Language Models, (2) Networks &amp; Cloud, (3) Computer Vision, (4) HCI &amp; Interactive Systems, และ (5) Software Architecture</w:t>
+        <w:br/>
+        <w:t>- การ​จัดการ​การ​ทับซ้อน: ใช้​อัลกอริทึม Repulsion Force และ Collision Avoidance เพื่อ​ป้องกัน​ไม่​ให้​โหนด​และ​ป้ายชื่อ​ทับซ้อน​กัน พร้อม​ฟังก์ชัน​คลิก​ที่​โหนด​เพื่อ​ดู​รายการ​บทความ​วิจัย​จริง​และ​คำ​สำคัญ​ที่​เชื่อมโยง​ใน​แถบ​ด้าน​ข้าง​ได้​ทันที</w:t>
       </w:r>
     </w:p>
     <w:p>
@@ -1377,7 +1189,7 @@
           <w:color w:val="0F172A"/>
           <w:sz w:val="32"/>
         </w:rPr>
-        <w:t>2.2 Interactive Keyword Word Cloud (คลาวด์​คำ​สำคัญ​เชิง​โต้ตอบ)</w:t>
+        <w:t>2.2 Dynamic Semantic Word Cloud</w:t>
       </w:r>
     </w:p>
     <w:p>
@@ -1391,7 +1203,7 @@
           <w:rFonts w:ascii="TH Sarabun New" w:hAnsi="TH Sarabun New"/>
           <w:sz w:val="32"/>
         </w:rPr>
-        <w:t>Word Cloud แบบ​โต้ตอบ​ทำหน้าที่​สรุป​ความหนาแน่น​เชิง​ความถี่​ของ​คำ​สำคัญ (Lexical Density) ใน​ภาพรวม โดย​ขนาด​ของ​ตัวอักษร​สะท้อน​ถึง​จำนวน​เอกสาร​วิจัย และ​สี​ของ​ตัวอักษร​ถูก​จัดหมวดหมู่​ตาม Thematic Clusters ความสัมพันธ์​กับ​ข้อมูล​คือ​การ​เปิดโอกาส​ให้​ผู้ใช้​สามารถ​เลือก​ดู​ตาม​ปี​ที่​ตีพิมพ์ (Publication Year) ตั้งแต่​ปี 2020 ถึง 2026 เพื่อ​สังเกต​การเปลี่ยนแปลง​ของ​คำศัพท์​สำคัญ เช่น ใน​ช่วง​ปี 2020–2021 คำ​ว่า 'convolutional neural networks' และ 'wireless sensor networks' มี​ขนาด​เด่นชัด ขณะที่​ใน​ปี 2024–2026 คำ​ว่า 'large language models', 'transformers' และ 'prompt engineering' ขยาย​ขนาด​ขึ้น​อย่าง​ก้าว​กระโดด</w:t>
+        <w:t>คลาวด์​คำ​สำคัญ​ได้รับ​การ​ออกแบบ​ด้วย​อัลกอริทึม​วาง​คำศัพท์​แบบ​ไร้​การ​ซ้อนทับ (Collision-free Layout) โดย​ขนาด​ตัวอักษร​แปรผัน​ตาม​จำนวน​บทความ และ​สี​ของ​ตัวอักษร​แบ่ง​ตาม Thematic Clusters ผู้ใช้​สามารถ​ปรับ​เลือก​ดู​ตาม​ปี​ที่​ตีพิมพ์ (2020 ถึง 2026) เพื่อ​สังเกต​การเปลี่ยนแปลง​เชิง​วิวัฒนาการ​ของ​คำศัพท์ เช่น การ​เติบโต​อย่าง​รวดเร็ว​ของ transformers, large language models, และ generative ai ใน​ช่วง​ปี 2024–2026</w:t>
       </w:r>
     </w:p>
     <w:p>
@@ -1406,7 +1218,7 @@
           <w:color w:val="0F172A"/>
           <w:sz w:val="32"/>
         </w:rPr>
-        <w:t>2.3 Cross-Subject Topic Overlap Heatmap (การ​ถ่ายทอด​องค์ความรู้​ข้าม​สาขาวิชา)</w:t>
+        <w:t>2.3 Cross-Disciplinary Topic Overlap Heatmap</w:t>
       </w:r>
     </w:p>
     <w:p>
@@ -1420,7 +1232,7 @@
           <w:rFonts w:ascii="TH Sarabun New" w:hAnsi="TH Sarabun New"/>
           <w:sz w:val="32"/>
         </w:rPr>
-        <w:t>แผนภูมิ​ความร้อน​ความสัมพันธ์​ข้าม​สาขา​ถูก​สร้าง​ขึ้น​เพื่อ​ทดสอบ​สมมติฐาน​การ​ผสมผสาน​ศาสตร์ (Interdisciplinary Integration) โดย​แถว​ใน​แนวตั้ง​แทน Subject Area ทั้ง 10 สาขา และ​คอลัมน์​ใน​แนวนอน​แทน​คำ​สำคัญ​ยอดนิยม 12 อันดับ​แรก ความ​เข้ม​ของ​สี​สะท้อน​ถึง​จำนวน​บท​ความใน​สาขา​นั้นๆ ที่​หยิบยก​คำ​สำคัญ​ดังกล่าว​ไป​ใช้ ผลการวิเคราะห์​พบ​ว่า คำ​สำคัญ​ใน​กลุ่ม 'deep learning' และ 'machine learning' มี​การ​กระจาย​ตัว​ข้าม​สาขา​อย่าง​กว้างขวาง โดย​ไม่​ได้​จำกัด​อยู่​เพียง​สาขา Artificial Intelligence เท่านั้น แต่​ยัง​ถูก​นำไปใช้​อย่าง​หนาแน่น​ใน Computer Vision, Signal Processing, Computer Networks, และ Software Engineering แสดงให้เห็น​ว่า AI ได้​กลาย​สภาพ​เป็น​เครื่องมือ​พื้นฐาน (General-Purpose Technology) ของ​ทุก​สาขา​ใน​ปัจจุบัน</w:t>
+        <w:t>แผนภูมิ​ความร้อน​แสดง​ระดับ​ความหนาแน่น​ของ​การ​ประยุกต์ใช้​เทคโนโลยี​หลัก​ข้าม 10 สาขาวิชา โดย​แถว​ใน​แนวตั้ง​แทน 10 สาขาวิชา​ของ Scopus และ​คอลัมน์​ใน​แนวนอน​แทน​คำ​สำคัญ​ที่​เป็น​สะพาน​เชื่อมโยง​เทคโนโลยี (Cross-cutting Technologies) ความ​เข้ม​ของ​สี​ที่​ไล่​ระดับ​อย่าง​ต่อเนื่อง (Gradient) ช่วย​ให้​เห็น​ความ​เชื่อมโยง​ข้าม​ศาสตร์​ได้​อย่าง​ชัดเจน โดย​พบ​ว่า Machine Learning และ Deep Learning มี​การ​กระจาย​ตัว​เข้าไป​ใน Computer Vision, Signal Processing, Computer Networks และ Software Engineering อย่าง​หนาแน่น สะท้อน​ว่า AI ได้​กลาย​สภาพ​เป็น​เครื่องมือ​อเนกประสงค์​ของ​วิทยาการ​คอมพิวเตอร์​ใน​ปัจจุบัน</w:t>
       </w:r>
     </w:p>
     <w:p>
@@ -1475,7 +1287,7 @@
           <w:color w:val="64748B"/>
           <w:sz w:val="28"/>
         </w:rPr>
-        <w:t>รูป​ที่ 4: แผนภูมิ​ความร้อน​แสดง​การปรากฏ​ของ​คำ​สำคัญ​ข้าม 10 สาขาวิชา (Cross-Subject Heatmap)</w:t>
+        <w:t>รูป​ที่ 4: แผนภูมิ​ความร้อน​แสดง​การ​กระจาย​ตัว​ของ​เทคโนโลยี​ข้าม 10 สาขาวิชา (Cross-Disciplinary Heatmap)</w:t>
       </w:r>
     </w:p>
     <w:p>
@@ -1490,7 +1302,7 @@
           <w:color w:val="0F172A"/>
           <w:sz w:val="32"/>
         </w:rPr>
-        <w:t>2.4 Strategic Topic Growth Quadrant (จตุ​ภาค​วิเคราะห์​การ​เติบโต​เชิง​ยุทธศาสตร์)</w:t>
+        <w:t>2.4 Strategic Topic Growth &amp; Evolution Quadrant</w:t>
       </w:r>
     </w:p>
     <w:p>
@@ -1504,7 +1316,7 @@
           <w:rFonts w:ascii="TH Sarabun New" w:hAnsi="TH Sarabun New"/>
           <w:sz w:val="32"/>
         </w:rPr>
-        <w:t>เพื่อ​ตอบสนอง​ต่อ​การ​วิเคราะห์​แนวโน้ม​ในอนาคต กลุ่ม​ผู้จัดทำ​ได้​สร้าง​กราฟ​วิเคราะห์ 4 จตุ​ภาค โดย​คำนวณ​อัตรา​การ​เติบโต​เชิง​สัมพัทธ์​ของ​คำ​สำคัญ ผ่าน​ตัว​ชี้​วัด Normalized Prevalence Growth Score ($G$) ซึ่ง​นิยาม​โดย:</w:t>
+        <w:t>กราฟ​วิเคราะห์ 4 จตุ​ภาค​ประเมิน​การ​เติบโต​เชิง​ยุทธศาสตร์ โดย​คำนวณ Normalized Prevalence Growth Score ($G$) เปรียบเทียบ​ช่วง​ปี​ล่าสุด (2024–2026) กับ​ช่วง​ปี​ก่อนหน้า (2020–2023):</w:t>
       </w:r>
     </w:p>
     <w:p>
@@ -1518,7 +1330,7 @@
           <w:rFonts w:ascii="TH Sarabun New" w:hAnsi="TH Sarabun New"/>
           <w:sz w:val="32"/>
         </w:rPr>
-        <w:t>G = log2( (Recent_docs / rTotal + 0.001) / (Prior_docs / pTotal + 0.001) )</w:t>
+        <w:t>G = log2( (Recent_docs / rTotal + 0.002) / (Prior_docs / pTotal + 0.002) )</w:t>
       </w:r>
     </w:p>
     <w:p>
@@ -1532,95 +1344,15 @@
           <w:rFonts w:ascii="TH Sarabun New" w:hAnsi="TH Sarabun New"/>
           <w:sz w:val="32"/>
         </w:rPr>
-        <w:t>โดย Recent_docs คือ​จำนวน​บท​ความใน​ช่วง​ปี​ล่าสุด (2024–2026) และ Prior_docs คือ​จำนวน​บท​ความใน​ช่วง​ก่อนหน้า (2020–2023) นำมา​พล็อต​เทียบ​กับ​ปริมาณ​บท​ความจริง​ใน​ช่วง​ล่าสุด (Recent Volume) บน​แกน Y ทำให้​สามารถ​แบ่ง​หัวข้อ​วิจัย​ออก​เป็น 4 จตุ​ภาค​ที่​มี​ความสัมพันธ์​กับ​ข้อมูล​อย่าง​ชัดเจน:</w:t>
-      </w:r>
-    </w:p>
-    <w:p>
-      <w:pPr>
-        <w:pStyle w:val="ListBullet"/>
-        <w:spacing w:after="60"/>
-        <w:jc w:val="left"/>
-      </w:pPr>
-      <w:r>
-        <w:rPr>
-          <w:rFonts w:ascii="TH Sarabun New" w:hAnsi="TH Sarabun New"/>
-          <w:b/>
-          <w:sz w:val="32"/>
-        </w:rPr>
-        <w:t xml:space="preserve">1. High-Volume Emerging Topics (จตุ​ภาค​ขวา​บน): </w:t>
-      </w:r>
-      <w:r>
-        <w:rPr>
-          <w:rFonts w:ascii="TH Sarabun New" w:hAnsi="TH Sarabun New"/>
-          <w:sz w:val="32"/>
-        </w:rPr>
-        <w:t>หัวข้อ​ที่​มี​ปริมาณ​บท​ความสูง​และ​มี​อัตรา​การ​เติบโต​เป็น​บวก​อย่าง​ต่อเนื่อง เช่น Large Language Models, Transformers, Foundation Models และ Edge Computing ซึ่ง​เป็น​กระแส​หลัก​ที่​กำลัง​ขับเคลื่อน​อุตสาหกรรม</w:t>
-      </w:r>
-    </w:p>
-    <w:p>
-      <w:pPr>
-        <w:pStyle w:val="ListBullet"/>
-        <w:spacing w:after="60"/>
-        <w:jc w:val="left"/>
-      </w:pPr>
-      <w:r>
-        <w:rPr>
-          <w:rFonts w:ascii="TH Sarabun New" w:hAnsi="TH Sarabun New"/>
-          <w:b/>
-          <w:sz w:val="32"/>
-        </w:rPr>
-        <w:t xml:space="preserve">2. Established Topics (จตุ​ภาค​ซ้าย​บน): </w:t>
-      </w:r>
-      <w:r>
-        <w:rPr>
-          <w:rFonts w:ascii="TH Sarabun New" w:hAnsi="TH Sarabun New"/>
-          <w:sz w:val="32"/>
-        </w:rPr>
-        <w:t>หัวข้อ​หลัก​ที่​มี​ปริมาณ​บท​ความสูง​แต่​มี​อัตรา​การ​เติบโต​ที่​เริ่ม​ทรงตัว​หรือ​ชะลอตัว​ลง เช่น Neural Networks, Cloud Computing, Wireless Networks และ Pattern Recognition ซึ่ง​ถือเป็น​องค์ความรู้​พื้นฐาน​ที่​อิ่มตัว​แล้ว</w:t>
-      </w:r>
-    </w:p>
-    <w:p>
-      <w:pPr>
-        <w:pStyle w:val="ListBullet"/>
-        <w:spacing w:after="60"/>
-        <w:jc w:val="left"/>
-      </w:pPr>
-      <w:r>
-        <w:rPr>
-          <w:rFonts w:ascii="TH Sarabun New" w:hAnsi="TH Sarabun New"/>
-          <w:b/>
-          <w:sz w:val="32"/>
-        </w:rPr>
-        <w:t xml:space="preserve">3. Emerging Niche Topics (จตุ​ภาค​ขวา​ล่าง): </w:t>
-      </w:r>
-      <w:r>
-        <w:rPr>
-          <w:rFonts w:ascii="TH Sarabun New" w:hAnsi="TH Sarabun New"/>
-          <w:sz w:val="32"/>
-        </w:rPr>
-        <w:t>หัวข้อ​เกิด​ใหม่​เฉพาะทาง​ที่​มี​อัตรา​การ​เติบโต​สูง​มาก แม้​ปริมาณ​บทความ​จะ​ยัง​ไม่​มาก​นัก เช่น Prompt Engineering, Contrastive Learning, Explainable AI, และ Neuromorphic Computing ซึ่ง​มี​ศักยภาพ​ใน​การขยับ​ขึ้น​เป็น​กระแส​หลัก​ในอนาคต</w:t>
-      </w:r>
-    </w:p>
-    <w:p>
-      <w:pPr>
-        <w:pStyle w:val="ListBullet"/>
-        <w:spacing w:after="60"/>
-        <w:jc w:val="left"/>
-      </w:pPr>
-      <w:r>
-        <w:rPr>
-          <w:rFonts w:ascii="TH Sarabun New" w:hAnsi="TH Sarabun New"/>
-          <w:b/>
-          <w:sz w:val="32"/>
-        </w:rPr>
-        <w:t xml:space="preserve">4. Declining or Stable Niche Topics (จตุ​ภาค​ซ้าย​ล่าง): </w:t>
-      </w:r>
-      <w:r>
-        <w:rPr>
-          <w:rFonts w:ascii="TH Sarabun New" w:hAnsi="TH Sarabun New"/>
-          <w:sz w:val="32"/>
-        </w:rPr>
-        <w:t>หัวข้อ​เฉพาะทาง​ที่​มี​อัตรา​การ​เติบโต​ลดลง​และ​ปริมาณ​บท​ความจำกัด เช่น Shader Programming, Microprocessor Architecture แบบ​ดั้งเดิม, และ Formal Automata Verification</w:t>
+        <w:t>นำมา​พล็อต​เทียบ​กับ​ปริมาณ​บท​ความจริง​ใน​ช่วง​ล่าสุด (Recent Volume) บน​แกน Y ทำให้​สามารถ​แบ่ง​หัวข้อ​วิจัย​ออก​เป็น 4 โซน​ได้​อย่าง​สมดุล:</w:t>
+        <w:br/>
+        <w:t>1. High-Volume Emerging Topics (ขวา​บน): หัวข้อ​ที่​เติบโต​เร็ว​และ​มี​ปริมาณ​บท​ความสูง เช่น Large Language Models, Transformers, Generative AI</w:t>
+        <w:br/>
+        <w:t>2. Core Established Topics (ซ้าย​บน): หัวข้อ​หลัก​ที่​มี​ปริมาณ​บท​ความสูง​และ​มี​อัตรา​การ​ตีพิมพ์​ต่อเนื่อง เช่น Neural Networks, Cloud Computing, Wireless Networks</w:t>
+        <w:br/>
+        <w:t>3. Emerging Niche Topics (ขวา​ล่าง): หัวข้อ​ใหม่​เฉพาะทาง​ที่​มี​อัตรา​การ​เติบโต​สูง เช่น Prompt Engineering, Explainable AI, Contrastive Learning</w:t>
+        <w:br/>
+        <w:t>4. Specialized / Stable Topics (ซ้าย​ล่าง): หัวข้อ​เฉพาะทาง​ที่​มี​อัตรา​คงที่ เช่น Microprocessor Design แบบ​ดั้งเดิม, Combinatorial Optimization</w:t>
       </w:r>
     </w:p>
     <w:p>
@@ -1690,7 +1422,7 @@
           <w:color w:val="0F172A"/>
           <w:sz w:val="32"/>
         </w:rPr>
-        <w:t>2.5 Scopus Document Explorer (ระบบ​สำรวจ​บทความ​แบบ​โต้ตอบ)</w:t>
+        <w:t>2.5 Exploratory Data Metrics &amp; Literature Explorer</w:t>
       </w:r>
     </w:p>
     <w:p>
@@ -1704,7 +1436,7 @@
           <w:rFonts w:ascii="TH Sarabun New" w:hAnsi="TH Sarabun New"/>
           <w:sz w:val="32"/>
         </w:rPr>
-        <w:t>มุมมอง​ที่ 5 ใน​แด​ช​บอร์ด​คือ​ระบบ​สืบค้น​บท​ความจริง (Document Explorer) ที่​เชื่อมโยง​บทคัดย่อ​และ​ข้อมูล​ทาง​บรรณานุกรม​เข้ากับ​ผลการวิเคราะห์ ผู้ใช้​สามารถ​สืบค้น​ด้วย​ข้อความ​อิสระ กรอง​ตาม​สาขาวิชา และ​เรียงลำดับ​ตาม​จำนวน​การ​อ้างอิง​หรือ​ปี​ที่​ตีพิมพ์ พร้อม​เปิด​หน้าต่าง Modal เพื่อ​อ่าน​บทคัดย่อ​ฉบับ​เต็ม​และ​เข้าถึง​ลิงก์ DOI ของ​เอกสาร​ต้นฉบับ​ได้​ทันที</w:t>
+        <w:t>แด​ช​บอร์ด​ส่วน​ที่ 5 และ 6 ประกอบด้วย​มุมมอง​สถิติ​เชิง​พรรณนา (สัดส่วน​บทความ​ดิบ​เทียบ​กับ​บท​ความสะอาด และ​กราฟ​พื้นที่​แนวโน้ม​รายปี) และ​ระบบ​สืบค้น​บทความ​วิจัย (Literature Explorer) ที่​เปิดโอกาส​ให้​ผู้ใช้งาน​สามารถ​ค้นหา​บทความ​ตาม​ชื่อเรื่อง ผู้แต่ง คำ​สำคัญ กรอง​ตาม​สาขาวิชา และ​เรียง​ตาม​จำนวน​การ​อ้างอิง พร้อม​เปิด​หน้าต่าง Modal เพื่อ​อ่าน​บทคัดย่อ​ฉบับ​เต็ม​และ​เข้าถึง​ลิงก์ DOI ได้​ทันที</w:t>
       </w:r>
     </w:p>
     <w:p>
@@ -1739,7 +1471,7 @@
           <w:color w:val="0F172A"/>
           <w:sz w:val="32"/>
         </w:rPr>
-        <w:t>3.1 การ​บูรณาการ​ฟิลด์​ข้อความ (Text Concatenation Strategy)</w:t>
+        <w:t>3.1 การ​รวม​ฟิลด์​ข้อความ (Text Concatenation Strategy)</w:t>
       </w:r>
     </w:p>
     <w:p>
@@ -1753,7 +1485,7 @@
           <w:rFonts w:ascii="TH Sarabun New" w:hAnsi="TH Sarabun New"/>
           <w:sz w:val="32"/>
         </w:rPr>
-        <w:t>ใน​การ​เตรียม​ข้อมูล Scopus เพื่อ​นำ​ไป​ป้อน​เข้าสู่​โมเดล Machine Learning หรือ Deep Learning ข้อมูล​ที่​กระจัดกระจาย​อยู่​ใน​คอลัมน์​ต่างๆ จำเป็นต้อง​ได้รับ​การ​จัด​โครงสร้าง​เป็น​ข้อความ​ประโยค​เดี่ยว (Single Structured Document Text) เพื่อ​รักษา​บริบท​และ​บทบาท​ทาง​ความหมาย​ของ​แต่ละ​องค์ประกอบ โดย​กลุ่ม​นิสิต​ได้​ใช้​ฟังก์ชัน​การ​รวม​ข้อความ​ตาม​แนว​ทางใน​สมุด​งาน Colab ของ​อาจารย์ ดังนี้:</w:t>
+        <w:t>เพื่อ​เตรียม​ข้อมูล​สำหรับ​ป้อน​เข้าสู่​โมเดล​ประมวลผล​ภาษาธรรมชาติ​และ Machine Learning ข้อมูล​ใน​คอลัมน์ Title, Abstract, Author Keywords และ Index Keywords ได้​ถูก​นำมา​รวม​เข้าด้วยกัน​เป็น​ข้อความ​เดี่ยว โดย​ใส่​คำนำหน้า​ระบุ​ประเภท​ข้อมูล​อย่าง​ชัดเจน​ตาม​แนว​ทางใน​สมุด​งาน Colab ของ​อาจารย์ผู้สอน:</w:t>
       </w:r>
     </w:p>
     <w:p>
@@ -1764,22 +1496,21 @@
       <w:r>
         <w:rPr>
           <w:rFonts w:ascii="Consolas" w:hAnsi="Consolas"/>
-          <w:color w:val="0F172A"/>
-          <w:sz w:val="24"/>
+          <w:sz w:val="22"/>
         </w:rPr>
         <w:t>def combine_text(row):</w:t>
         <w:br/>
-        <w:t xml:space="preserve">    text_parts = []</w:t>
+        <w:t xml:space="preserve">    parts = []</w:t>
         <w:br/>
-        <w:t xml:space="preserve">    if row['title']: text_parts.append(f"Title: {row['title']}")</w:t>
+        <w:t xml:space="preserve">    if row['title']: parts.append(f"Title: {row['title']}")</w:t>
         <w:br/>
-        <w:t xml:space="preserve">    if row['abstract']: text_parts.append(f"Abstract: {row['abstract']}")</w:t>
+        <w:t xml:space="preserve">    if row['abstract']: parts.append(f"Abstract: {row['abstract']}")</w:t>
         <w:br/>
-        <w:t xml:space="preserve">    if row['author_keywords']: text_parts.append(f"Author keywords: {row['author_keywords']}")</w:t>
+        <w:t xml:space="preserve">    if row['author_keywords']: parts.append(f"Author keywords: {row['author_keywords']}")</w:t>
         <w:br/>
-        <w:t xml:space="preserve">    if row['index_keywords']: text_parts.append(f"Index keywords: {row['index_keywords']}")</w:t>
+        <w:t xml:space="preserve">    if row['index_keywords']: parts.append(f"Index keywords: {row['index_keywords']}")</w:t>
         <w:br/>
-        <w:t xml:space="preserve">    return '\n'.join(text_parts)</w:t>
+        <w:t xml:space="preserve">    return '\n'.join(parts)</w:t>
       </w:r>
     </w:p>
     <w:p>
@@ -1793,7 +1524,7 @@
           <w:rFonts w:ascii="TH Sarabun New" w:hAnsi="TH Sarabun New"/>
           <w:sz w:val="32"/>
         </w:rPr>
-        <w:t>เหตุผล​สำคัญ​ใน​การ​ใส่​คำนำหน้า​ระบุ​ประเภท​ข้อมูล (เช่น 'Title:', 'Abstract:', 'Author keywords:') คือ​การ​ช่วย​ให้​โมเดล​การเรียน​รู้ทาง​ภาษา​สามารถ​จำแนก​ความสำคัญ​ของ​ส่วน​ต่างๆ ได้ โดย Title บรรจุ​แก่น​หลัก​ของ​บทความ Abstract บรรจุ​บริบท​และ​ผล​การทดลอง​อย่าง​ละเอียด ขณะที่ Keywords บรรจุ​คำศัพท์​เฉพาะทาง​ระดับสูง</w:t>
+        <w:t>การ​จัด​โครงสร้าง​เช่นนี้​ช่วย​ให้​โมเดล​ภาษา​เข้าใจ​ลำดับความสำคัญ​ของ​แต่ละ​ส่วน​ได้​อย่าง​เป็นธรรมชาติ โดย Title สื่อ​ถึงแก่น​หลัก​ของ​บทความ Abstract บรรจุ​บริบท​และ​ผล​การทดลอง​อย่าง​ละเอียด ขณะที่ Keywords บรรจุ​คำศัพท์​ทางเทคนิค​ระดับสูง</w:t>
       </w:r>
     </w:p>
     <w:p>
@@ -1822,16 +1553,10 @@
           <w:rFonts w:ascii="TH Sarabun New" w:hAnsi="TH Sarabun New"/>
           <w:sz w:val="32"/>
         </w:rPr>
-        <w:t>โมเดล​จำพวก Transformer สำหรับ​งานวิจัย​ทางวิทยาศาสตร์ เช่น SPECTER2 (`allenai/specter2_base`) และ SciBERT มี​ข้อจำกัด​ทาง​สถาปัตยกรรม​ด้าน​ตำแหน่ง (Positional Embeddings) ที่​รับ​ความ​ยาว​ข้อความ​สูงสุด​ได้​ไม่​เกิน 512 โท​เค็น จาก​การสำรวจ​ทาง​สถิติ​ใน​ชุด​ข้อมูล​สะอาด​จำนวน 6,988 รายการ พบ​ว่า:</w:t>
-        <w:br/>
-        <w:t>- ความ​ยาว​ข้อความ​รวม​เฉลี่ย​อยู่​ที่ 169.9 โท​เค็น</w:t>
-        <w:br/>
-        <w:t>- ค่า​มัธยฐาน​อยู่​ที่ 159.9 โท​เค็น</w:t>
-        <w:br/>
-        <w:t>- มี​บทความ​ประมาณ 0.0% ที่​มี​ความ​ยาว​เกิน​กว่า 512 โท​เค็น​และ​จำเป็นต้อง​ถูก​ตัด (Truncation)</w:t>
+        <w:t>โมเดล Transformer สำหรับ​งานวิจัย​ทางวิทยาศาสตร์ เช่น SPECTER2 (`allenai/specter2_base`) มี​ข้อจำกัด​สถาปัตยกรรม​ด้าน​ตำแหน่ง (Positional Embeddings) ที่​รับ​ความ​ยาว​ข้อความ​สูงสุด​ได้​ไม่​เกิน 512 โท​เค็น จาก​การ​วิเคราะห์​ใน​ชุด​ข้อมูล​สะอาด​จำนวน 6,991 รายการ พบ​ว่า​ข้อความ​รวม​มี​ความ​ยาว​เฉลี่ย 159.7 โท​เค็น และ​มี​บทความ​เพียง 0.0% ที่​มี​ความ​ยาว​เกิน 512 โท​เค็น​และ​จำเป็นต้อง​ถูก​ตัด (Truncation)</w:t>
         <w:br/>
         <w:br/>
-        <w:t>ผลกระทบ​จาก​การ​ตัด​ข้อความ​ที่​เกิน 512 โท​เค็น: เนื่องจาก​โครงสร้าง​การ​รวม​ข้อความ​ได้​วาง 'Author keywords' และ 'Index keywords' ไว้​ที่​ส่วน​ท้ายสุด​ของ​ข้อความ หาก​บทความ​ใด​มี Abstract ที่​ยาว​มาก คำ​สำคัญ​บางส่วน​อาจ​ถูก​ตัดทิ้ง​ไม่​ถูก​นำ​เข้าไป​คำนวณ​ใน​ชั้น Transformer อย่างไรก็ตาม ในทางปฏิบัติ Abstract ส่วน​ต้น​และ​ชื่อเรื่อง (Title) มี​น้ำหนัก​ความสำคัญ​ต่อ​การ​สร้าง​เวกเตอร์​ความหมาย​สูง​ที่สุด ทำให้​เวกเตอร์​ที่​ได้​จาก​โมเดล SPECTER2 ยังคง​สามารถ​จับ​ความหมาย​ของ​บทความ​ได้​อย่าง​ถูกต้อง​และ​แม่นยำ​สูง</w:t>
+        <w:t>ผลกระทบ​จาก​การ​ตัด​ข้อความ​ที่​เกิน 512 โท​เค็น: เนื่องจาก​โครงสร้าง​การ​รวม​ข้อความ​ได้​วาง 'Author keywords' และ 'Index keywords' ไว้​ที่​ส่วน​ท้ายสุด​ของ​ข้อความ หาก​บทความ​ใด​มี Abstract ที่​ยาว​มาก คำ​สำคัญ​บางส่วน​อาจ​ถูก​ตัดทิ้ง​ไม่​ถูก​นำ​เข้าไป​คำนวณ​ใน​โมเดล อย่างไรก็ตาม Title และ​สาระสำคัญ​ส่วนใหญ่​ใน Abstract ยังคง​ได้รับ​การ​แปลง​เป็น​เวกเตอร์​อย่าง​ครบถ้วน ทำให้​เวกเตอร์​ความหมาย​ยังคง​มี​ความแม่นยำ​สูง</w:t>
       </w:r>
     </w:p>
     <w:p>
@@ -1860,7 +1585,7 @@
           <w:rFonts w:ascii="TH Sarabun New" w:hAnsi="TH Sarabun New"/>
           <w:sz w:val="32"/>
         </w:rPr>
-        <w:t>การ​สร้าง Document Embeddings ด้วย​โมเดล SPECTER2 ร่วมกับ Proximity Adapter จะ​ส่งออก​เวกเตอร์​แบบ​หนาแน่น (Dense Feature Vector) ที่​มี​ขนาด​มิติ​เท่ากับ 768 มิติ ($d = 768$) สำหรับ​บทความ​แต่ละ​เรื่อง ขั้น​ตอนสำคัญ​ที่​จำเป็นต้อง​ทำ​ก่อน​นำ​เวกเตอร์​ไป​ใช้งาน​ใน Machine Learning คือ​การ​ปรับ​ขนาด​เวกเตอร์​ด้วย L2 Normalization โดย​ใช้​คำสั่ง `normalize(embeddings, norm='l2')` จาก​ไลบรารี Scikit-learn:</w:t>
+        <w:t>โมเดล SPECTER2 ส่งออก​เวกเตอร์​แบบ​หนาแน่น (Dense Feature Vector) ขนาด 768 มิติ ($d = 768$) สำหรับ​บทความ​แต่ละ​เรื่อง ก่อน​นำ​เวกเตอร์​ไป​ใช้งาน​ใน​อัลกอริทึม Machine Learning จำเป็นต้อง​ทำการ​ปรับ​ขนาด​เวกเตอร์​ด้วย L2 Normalization โดย​ใช้​คำสั่ง `normalize(embeddings, norm='l2')`:</w:t>
       </w:r>
     </w:p>
     <w:p>
@@ -1890,11 +1615,11 @@
         </w:rPr>
         <w:t>ประโยชน์​ของ​การ​ทำ L2 Normalization:</w:t>
         <w:br/>
-        <w:t>1. ทำให้​ขนาด​ของ​เวกเตอร์​ทุก​บทความ​มี​ความ​ยาว​เท่ากับ 1 หน่วย (Unit Sphere)</w:t>
+        <w:t>1. ทำให้​ขนาด​ของ​เวกเตอร์​ทุก​บทความ​มี​ความ​ยาว​เท่ากับ 1 หน่วย (Unit Euclidean Norm)</w:t>
         <w:br/>
-        <w:t>2. ช่วย​ให้​การคำนวณ Cosine Similarity ระหว่าง​บทความ​สอง​เรื่อง​สามารถ​ทำได้​รวดเร็ว​ขึ้น​ผ่าน​การคูณ​แบบ Dot Product โดยตรง ($v_A \cdot v_B$)</w:t>
+        <w:t>2. ช่วย​ให้​การคำนวณ Cosine Similarity ระหว่าง​บท​ความสามารถ​ทำได้​รวดเร็ว​ผ่าน Dot Product โดยตรง ($v_A \cdot v_B$)</w:t>
         <w:br/>
-        <w:t>3. ป้องกัน​ปัญหา​ความเอนเอียง (Bias) ที่เกิด​จาก​ความ​ยาว​ของ​เอกสาร และ​ช่วย​ให้​อัลกอริทึม​ประเภท Distance-based (เช่น K-Means, KNN, SVM) ทำงาน​ได้​อย่าง​มี​เสถียรภาพ​และ​ลู่​เข้าสู่​คำตอบ​ได้​รวดเร็ว​ยิ่งขึ้น</w:t>
+        <w:t>3. ขจัด​ความเอนเอียง​ที่เกิด​จาก​ความ​ยาว​ของ​เอกสาร และ​ช่วย​ให้​อัลกอริทึม Machine Learning (เช่น K-Means, SVM, Logistic Regression) ทำงาน​ได้​อย่าง​มี​เสถียรภาพ​และ​มีประสิทธิภาพ​สูงสุด</w:t>
       </w:r>
     </w:p>
     <w:p>
@@ -1964,7 +1689,7 @@
           <w:color w:val="0F172A"/>
           <w:sz w:val="32"/>
         </w:rPr>
-        <w:t>3.4 แนวทาง​การนำ Feature Vector ไป​ประยุกต์ใช้​ใน Machine Learning</w:t>
+        <w:t>3.4 สคริปต์ scopus_eda_analysis.py และ​การ​นำไปใช้​ใน Machine Learning</w:t>
       </w:r>
     </w:p>
     <w:p>
@@ -1978,13 +1703,7 @@
           <w:rFonts w:ascii="TH Sarabun New" w:hAnsi="TH Sarabun New"/>
           <w:sz w:val="32"/>
         </w:rPr>
-        <w:t>ชุด​ข้อมูล​และ​เวกเตอร์​คุณลักษณะ​ขนาด (6988, 768) ที่​สร้าง​ขึ้น​นี้ มี​ความพร้อม​สมบูรณ์​สำหรับ​การนำ​ไป​ฝึกฝน​และ​ทดสอบ​โมเดล Machine Learning ใน 3 โจทย์​หลัก:</w:t>
-        <w:br/>
-        <w:t>1. การจำแนก​สาขาวิชา​อัตโนมัติ (Subject Classification): นำ​เวกเตอร์​ขนาด 768 มิติ เป็น Feature ($X$) และ​ใช้​คอลัมน์ Subject ทั้ง 10 สาขา เป็น​เป้าหมาย ($y$) เพื่อ​ฝึก​โมเดล​เช่น Logistic Regression, Support Vector Machines (SVM) หรือ Multi-Layer Perceptron (MLP) สำหรับ​จัดหมวดหมู่​งานวิจัย​ใหม่​ๆ โดยอัตโนมัติ</w:t>
-        <w:br/>
-        <w:t>2. การ​จัดกลุ่ม​เชิง​ความหมาย (Semantic Clustering): ประยุกต์ใช้​อัลกอริทึม K-Means หรือ HDBSCAN ใน​การ​จัดกลุ่ม​บทความ​โดย​ไม่ต้อง​มี​ป้าย​กำกับ (Unsupervised Learning) เพื่อ​ค้นหา​กลุ่ม​งานวิจัย​ย่อย (Sub-topics) หรือ​สาขา​ความรู้​ใหม่​ที่​กำลัง​รวมตัวกัน​ข้าม​ศาสตร์</w:t>
-        <w:br/>
-        <w:t>3. ระบบ​สืบค้น​และ​แนะนำ​บทความ​ที่​คล้ายคลึง (Semantic Search &amp; Recommendation): การ​ใช้​เทคนิค Approximate Nearest Neighbors (ANN) ใน​การ​ค้นหา​บทความ​ที่​มี​เวกเตอร์​ใกล้เคียง​กัน ช่วย​ให้​นักวิจัย​สามารถ​ค้นพบ​วรรณกรรม​ที่​เกี่ยวข้อง​ได้​แม้​จะ​ใช้​คำ​สำคัญ​ที่​เขียน​ไม่​ตรงกัน</w:t>
+        <w:t>กลุ่ม​ผู้จัดทำ​ได้​พัฒนา​สคริปต์ scopus_eda_analysis.py บรรจุ​ไว้​ใน​โฟลเดอร์​หลัก​ของ​โครงงาน เพื่อ​แสดง​การทำงาน​จริง​ตั้งแต่​การ​โหลด​ไฟล์ CSV, การ​ตรวจสอบ​และ​กำจัด​ข้อมูล​ซ้ำซ้อน, การกรอง​ภาษา​และ​บทความ​นอก​ศาสตร์, การคำนวณ​สถิติ​เชิง​พรรณนา, การ​รวม​ฟิลด์​ข้อความ, ไป​จนถึง​การสกัด​เวกเตอร์​คุณลักษณะ​ขนาด (6991, 768) และ​ทำ L2 Normalization ซึ่ง​พร้อม​นำ​ไป​ประยุกต์​ใช้งาน​ใน 3 งานหลัก ได้แก่ การจำแนก​สาขาวิชา​อัตโนมัติ (Subject Classification), การ​จัดกลุ่ม​ความหมาย​เชิง​วิทยาการ (Semantic Clustering ด้วย K-Means / HDBSCAN), และ​ระบบ​แนะนำ​บทความ​วิจัย​ที่​คล้ายคลึง​กัน (Content-Based Recommendation)</w:t>
       </w:r>
     </w:p>
     <w:p>
@@ -2004,7 +1723,7 @@
           <w:color w:val="1D4ED8"/>
           <w:sz w:val="36"/>
         </w:rPr>
-        <w:t>บทสรุป​และ​ข้อเสนอแนะ (Conclusion and Recommendations)</w:t>
+        <w:t>บทสรุป (Conclusion)</w:t>
       </w:r>
     </w:p>
     <w:p>
@@ -2018,21 +1737,7 @@
           <w:rFonts w:ascii="TH Sarabun New" w:hAnsi="TH Sarabun New"/>
           <w:sz w:val="32"/>
         </w:rPr>
-        <w:t>การ​ดำเนิน​โครงงาน EDA ข้อมูล​วิชาการ Scopus 10 สาขาวิชา​ใน​ครั้งนี้ ประสบความสำเร็จ​ตาม​เป้าหมาย​และ​ข้อกำหนด​ของ​รายวิชา​อย่าง​ครบถ้วน กลุ่ม​ผู้จัดทำ​ได้​เรียนรู้​ขั้นตอน​การ​สืบค้น​ข้อมูลจริง​จาก​ฐานข้อมูล​มาตรฐานสากล การแก้ปัญหา​คุณภาพ​ข้อมูล​ผ่าน​กระบวนการ Data Cleaning ที่​มี​ทั้ง​การ​กำจัด​บท​ความซ้ำซ้อน​ข้าม​สาขา การ​คัด​กรอง​บทความ​ที่​ขาด​บทคัดย่อ​หรือ​บท​ความต่าง​ภาษา ตลอดจน​การ​คัดแยก​บทความ​นอก​ศาสตร์​คอมพิวเตอร์ ซึ่ง​ช่วย​เพิ่ม​คุณภาพ​และ​ความน่าเชื่อถือ​ให้​แก่​ชุด​ข้อมูล​สะอาด​จำนวน 6,988 รายการ</w:t>
-      </w:r>
-    </w:p>
-    <w:p>
-      <w:pPr>
-        <w:spacing w:after="80"/>
-        <w:ind w:firstLine="720"/>
-        <w:jc w:val="left"/>
-      </w:pPr>
-      <w:r>
-        <w:rPr>
-          <w:rFonts w:ascii="TH Sarabun New" w:hAnsi="TH Sarabun New"/>
-          <w:sz w:val="32"/>
-        </w:rPr>
-        <w:t>ใน​ด้าน​การ​แสดงผล​ด้วย​ภาพ แด​ช​บอร์ด​ทั้ง 5 รูปแบบ​สามารถ​สะท้อน​พลวัต​ของ​งานวิจัย​ได้​อย่าง​ลึกซึ้ง โดย​ชี้ให้เห็น​อย่าง​ชัดเจน​ว่า​ปัญญาประดิษฐ์ และ​การเรียนรู้เชิงลึก​กำลัง​เป็น​แกน​ร่วมใน​การ​ขับเคลื่อน​ทุก​สาขาวิชา​ทาง​คอมพิวเตอร์ ขณะที่​สถาปัตยกรรม​การ​เตรียม Feature Vector ด้วย SPECTER2 และ​การ​ทำ L2 Normalization ได้​มอบ​รากฐาน​อัน​แข็งแกร่ง​สำหรับ​การนำ​ข้อมูล​ไป​พัฒนา​ระบบ Machine Learning ใน​ขั้นสูง​ต่อไป</w:t>
+        <w:t>การ​ดำเนิน​โครงงาน EDA ข้อมูล​วิชาการ Scopus 10 สาขาวิชา​ใน​ครั้งนี้ บรรลุ​วัตถุประสงค์​ตาม​เกณฑ์​การ​สอบ​กลาง​ภาค​อย่าง​ครบถ้วน กลุ่ม​นิสิต​ได้​ฝึกฝน​ทักษะ​การ​ทำความสะอาด​ข้อมูล​ทางวิชาการ​ขนาดใหญ่ การสกัด​และ​แสดงผล​ความสัมพันธ์​ของ​คำ​สำคัญ​ผ่าน​แด​ช​บอร์ด​ที่​ทันสมัย และ​เข้าใจ​รากฐาน​ของ​การ​แปลง​ข้อความ​เป็น​เวกเตอร์​ตัวเลข​สำหรับ Machine Learning อย่าง​แท้จริง</w:t>
       </w:r>
     </w:p>
     <w:p>
@@ -2060,7 +1765,7 @@
           <w:rFonts w:ascii="TH Sarabun New" w:hAnsi="TH Sarabun New"/>
           <w:sz w:val="28"/>
         </w:rPr>
-        <w:t>Cohan, A., Feldman, S., Beltagy, I., Downey, D., &amp; Weld, D. S. (2020). SPECTER: Document-level Representation Learning using Citation-informed Transformers. Proceedings of the 58th Annual Meeting of the Association for Computational Linguistics (ACL 2020), 2270-2282.</w:t>
+        <w:t>Cohan, A., et al. (2020). SPECTER: Document-level Representation Learning using Citation-informed Transformers. ACL 2020, 2270-2282.</w:t>
       </w:r>
     </w:p>
     <w:p>
@@ -2086,7 +1791,7 @@
           <w:rFonts w:ascii="TH Sarabun New" w:hAnsi="TH Sarabun New"/>
           <w:sz w:val="28"/>
         </w:rPr>
-        <w:t>Kwon, S., &amp; Surinta, O. (2023). Multi-agent and Intelligent Systems in Computer Science: Trends, Co-occurrence Networks, and Research Evolution. Journal of Computer Information Systems.</w:t>
+        <w:t>Pedregosa, F., et al. (2011). Scikit-learn: Machine Learning in Python. JMLR, 12, 2825-2830.</w:t>
       </w:r>
     </w:p>
     <w:p>
@@ -2099,20 +1804,7 @@
           <w:rFonts w:ascii="TH Sarabun New" w:hAnsi="TH Sarabun New"/>
           <w:sz w:val="28"/>
         </w:rPr>
-        <w:t>Pedregosa, F., et al. (2011). Scikit-learn: Machine Learning in Python. Journal of Machine Learning Research, 12, 2825-2830.</w:t>
-      </w:r>
-    </w:p>
-    <w:p>
-      <w:pPr>
-        <w:spacing w:after="80"/>
-        <w:ind w:left="720" w:hanging="720"/>
-      </w:pPr>
-      <w:r>
-        <w:rPr>
-          <w:rFonts w:ascii="TH Sarabun New" w:hAnsi="TH Sarabun New"/>
-          <w:sz w:val="28"/>
-        </w:rPr>
-        <w:t>Surinta, O. (2024). Keyword Co-occurrence Network and Analytics for Generative AI in Higher Education. GitHub Pages: https://mrolarik.github.io/keyword-co-occurrence-network/</w:t>
+        <w:t>Surinta, O. (2024). Keyword Co-occurrence Network and Analytics. GitHub Pages: https://mrolarik.github.io/keyword-co-occurrence-network/</w:t>
       </w:r>
     </w:p>
     <w:sectPr>

</xml_diff>

<commit_message>
Update report heading from Executive Summary to academic Abstract with keywords
</commit_message>
<xml_diff>
--- a/report/EDA_Scopus_Report.docx
+++ b/report/EDA_Scopus_Report.docx
@@ -81,7 +81,7 @@
           <w:color w:val="1D4ED8"/>
           <w:sz w:val="36"/>
         </w:rPr>
-        <w:t>บทสรุป​ผู้บริหาร (Executive Summary)</w:t>
+        <w:t>บทคัดย่อ (Abstract)</w:t>
       </w:r>
     </w:p>
     <w:p>
@@ -138,6 +138,27 @@
           <w:sz w:val="32"/>
         </w:rPr>
         <w:t>สำหรับ​การ​เตรียม​ข้อมูล​สร้าง Text Embedding ได้​ดำเนิน​การผสาน​ฟิลด์​ข้อความ Title, Abstract, Author Keywords และ Index Keywords พร้อมทั้ง​วิเคราะห์​ข้อ​จำกัดความ​ยาว 512 โท​เค็น​ของ​โมเดล SPECTER2 ซึ่ง​พบ​ว่า​ข้อมูล​มี​ความ​ยาว​เฉลี่ย 159.7 โท​เค็น และ​มี​บทความ​ที่​เกิน​ขีดจำกัด​เพียง 0.0% เท่านั้น และ​ได้​นำเสนอ​การ​ทำ L2 Normalization บน​เวกเตอร์​มิติ 768 เพื่อ​รอง​รับงาน Machine Learning ใน​การจำแนก​สาขา​และ​การ​จัดกลุ่ม​บทความ​ตาม​ความหมาย</w:t>
+      </w:r>
+    </w:p>
+    <w:p>
+      <w:pPr>
+        <w:spacing w:before="160" w:after="160"/>
+        <w:ind w:firstLine="720"/>
+      </w:pPr>
+      <w:r>
+        <w:rPr>
+          <w:rFonts w:ascii="TH Sarabun New" w:hAnsi="TH Sarabun New"/>
+          <w:b/>
+          <w:sz w:val="32"/>
+        </w:rPr>
+        <w:t xml:space="preserve">คำ​สำคัญ: </w:t>
+      </w:r>
+      <w:r>
+        <w:rPr>
+          <w:rFonts w:ascii="TH Sarabun New" w:hAnsi="TH Sarabun New"/>
+          <w:sz w:val="32"/>
+        </w:rPr>
+        <w:t>การ​วิเคราะห์​ข้อมูล​เชิง​สำรวจ (EDA), การ​ทำความสะอาด​ข้อมูล (Data Cleaning), การปรากฏ​ร่วมกัน​ของ​คำ​สำคัญ (Co-occurrence Network), ฐานข้อมูล Scopus, เวกเตอร์​คุณลักษณะ (Feature Vector), SPECTER2</w:t>
       </w:r>
     </w:p>
     <w:p>

</xml_diff>

<commit_message>
Fix Heatmap right side: populate cross-disciplinary keyword distributions across all 10 subjects and add interactive Diffusion Cell Inspector on the right sidebar
</commit_message>
<xml_diff>
--- a/report/EDA_Scopus_Report.docx
+++ b/report/EDA_Scopus_Report.docx
@@ -109,7 +109,7 @@
           <w:rFonts w:ascii="TH Sarabun New" w:hAnsi="TH Sarabun New"/>
           <w:sz w:val="32"/>
         </w:rPr>
-        <w:t>จาก​การ​ทำความสะอาด​ข้อมูล พบ​รายการ​ข้อมูล​ที่​มีปัญหา ได้แก่ บทความ​ที่​มี​การปรากฏ​ซ้ำซ้อน​ข้าม​สาขาวิชา​จำนวน 175 รายการ, บทความ​ภาษาต่างประเทศ​ที่​ไม่​ใช่​ภาษาอังกฤษ​จำนวน 25 รายการ, บทความ​ที่​ขาด​บทคัดย่อ​จำนวน 60 รายการ, และ​บทความ​นอก​บริบท​วิทยาการ​คอมพิวเตอร์​ที่​หลุด​เข้า​มาจาก​การ​สืบค้น​คำ​สำคัญ (เช่น ดัชนี​อสังหาริมทรัพย์​ใน​ดูไบ การ​จัดการ​โรงแรม ทันตกรรม และ​การเกษตร) จำนวน 60 รายการ หลังจาก​การ​คัด​กรอง​ทั้งหมด คงเหลือ​ชุด​ข้อมูล​สะอาด​พร้อม​ใช้งาน​ทั้งสิ้น 6,991 รายการ โดย​ทุก​สาขาวิชา​มี​จำนวน​บทความ​เกิน​เกณฑ์​ขั้นต่ำ 600 รายการ​อย่าง​ครบถ้วน (ระหว่าง 690 ถึง 704 รายการ)</w:t>
+        <w:t>จาก​การ​ทำความสะอาด​ข้อมูล พบ​รายการ​ข้อมูล​ที่​มีปัญหา ได้แก่ บทความ​ที่​มี​การปรากฏ​ซ้ำซ้อน​ข้าม​สาขาวิชา​จำนวน 172 รายการ, บทความ​ภาษาต่างประเทศ​ที่​ไม่​ใช่​ภาษาอังกฤษ​จำนวน 25 รายการ, บทความ​ที่​ขาด​บทคัดย่อ​จำนวน 60 รายการ, และ​บทความ​นอก​บริบท​วิทยาการ​คอมพิวเตอร์​ที่​หลุด​เข้า​มาจาก​การ​สืบค้น​คำ​สำคัญ (เช่น ดัชนี​อสังหาริมทรัพย์​ใน​ดูไบ การ​จัดการ​โรงแรม ทันตกรรม และ​การเกษตร) จำนวน 60 รายการ หลังจาก​การ​คัด​กรอง​ทั้งหมด คงเหลือ​ชุด​ข้อมูล​สะอาด​พร้อม​ใช้งาน​ทั้งสิ้น 6,994 รายการ โดย​ทุก​สาขาวิชา​มี​จำนวน​บทความ​เกิน​เกณฑ์​ขั้นต่ำ 600 รายการ​อย่าง​ครบถ้วน (ระหว่าง 690 ถึง 704 รายการ)</w:t>
       </w:r>
     </w:p>
     <w:p>
@@ -137,7 +137,7 @@
           <w:rFonts w:ascii="TH Sarabun New" w:hAnsi="TH Sarabun New"/>
           <w:sz w:val="32"/>
         </w:rPr>
-        <w:t>สำหรับ​การ​เตรียม​ข้อมูล​สร้าง Text Embedding ได้​ดำเนิน​การผสาน​ฟิลด์​ข้อความ Title, Abstract, Author Keywords และ Index Keywords พร้อมทั้ง​วิเคราะห์​ข้อ​จำกัดความ​ยาว 512 โท​เค็น​ของ​โมเดล SPECTER2 ซึ่ง​พบ​ว่า​ข้อมูล​มี​ความ​ยาว​เฉลี่ย 159.7 โท​เค็น และ​มี​บทความ​ที่​เกิน​ขีดจำกัด​เพียง 0.0% เท่านั้น และ​ได้​นำเสนอ​การ​ทำ L2 Normalization บน​เวกเตอร์​มิติ 768 เพื่อ​รอง​รับงาน Machine Learning ใน​การจำแนก​สาขา​และ​การ​จัดกลุ่ม​บทความ​ตาม​ความหมาย</w:t>
+        <w:t>สำหรับ​การ​เตรียม​ข้อมูล​สร้าง Text Embedding ได้​ดำเนิน​การผสาน​ฟิลด์​ข้อความ Title, Abstract, Author Keywords และ Index Keywords พร้อมทั้ง​วิเคราะห์​ข้อ​จำกัดความ​ยาว 512 โท​เค็น​ของ​โมเดล SPECTER2 ซึ่ง​พบ​ว่า​ข้อมูล​มี​ความ​ยาว​เฉลี่ย 160.6 โท​เค็น และ​มี​บทความ​ที่​เกิน​ขีดจำกัด​เพียง 0.0% เท่านั้น และ​ได้​นำเสนอ​การ​ทำ L2 Normalization บน​เวกเตอร์​มิติ 768 เพื่อ​รอง​รับงาน Machine Learning ใน​การจำแนก​สาขา​และ​การ​จัดกลุ่ม​บทความ​ตาม​ความหมาย</w:t>
       </w:r>
     </w:p>
     <w:p>
@@ -217,14 +217,14 @@
           <w:b/>
           <w:sz w:val="32"/>
         </w:rPr>
-        <w:t xml:space="preserve">1. Hardware and Architecture: </w:t>
+        <w:t xml:space="preserve">1. Information Systems: </w:t>
       </w:r>
       <w:r>
         <w:rPr>
           <w:rFonts w:ascii="TH Sarabun New" w:hAnsi="TH Sarabun New"/>
           <w:sz w:val="32"/>
         </w:rPr>
-        <w:t>ข้อมูลดิบ​ที่​ดึง​มา 734 รายการ, ข้อมูล​สะอาด​หลัง​คลี​น 692 รายการ</w:t>
+        <w:t>ข้อมูลดิบ​ที่​ดึง​มา 735 รายการ, ข้อมูล​สะอาด​หลัง​คลี​น 699 รายการ</w:t>
       </w:r>
     </w:p>
     <w:p>
@@ -239,7 +239,73 @@
           <w:b/>
           <w:sz w:val="32"/>
         </w:rPr>
-        <w:t xml:space="preserve">2. Information Systems: </w:t>
+        <w:t xml:space="preserve">2. Hardware and Architecture: </w:t>
+      </w:r>
+      <w:r>
+        <w:rPr>
+          <w:rFonts w:ascii="TH Sarabun New" w:hAnsi="TH Sarabun New"/>
+          <w:sz w:val="32"/>
+        </w:rPr>
+        <w:t>ข้อมูลดิบ​ที่​ดึง​มา 732 รายการ, ข้อมูล​สะอาด​หลัง​คลี​น 697 รายการ</w:t>
+      </w:r>
+    </w:p>
+    <w:p>
+      <w:pPr>
+        <w:pStyle w:val="ListBullet"/>
+        <w:spacing w:after="60"/>
+        <w:jc w:val="left"/>
+      </w:pPr>
+      <w:r>
+        <w:rPr>
+          <w:rFonts w:ascii="TH Sarabun New" w:hAnsi="TH Sarabun New"/>
+          <w:b/>
+          <w:sz w:val="32"/>
+        </w:rPr>
+        <w:t xml:space="preserve">3. Computer Graphics and Computer-Aided Design: </w:t>
+      </w:r>
+      <w:r>
+        <w:rPr>
+          <w:rFonts w:ascii="TH Sarabun New" w:hAnsi="TH Sarabun New"/>
+          <w:sz w:val="32"/>
+        </w:rPr>
+        <w:t>ข้อมูลดิบ​ที่​ดึง​มา 731 รายการ, ข้อมูล​สะอาด​หลัง​คลี​น 706 รายการ</w:t>
+      </w:r>
+    </w:p>
+    <w:p>
+      <w:pPr>
+        <w:pStyle w:val="ListBullet"/>
+        <w:spacing w:after="60"/>
+        <w:jc w:val="left"/>
+      </w:pPr>
+      <w:r>
+        <w:rPr>
+          <w:rFonts w:ascii="TH Sarabun New" w:hAnsi="TH Sarabun New"/>
+          <w:b/>
+          <w:sz w:val="32"/>
+        </w:rPr>
+        <w:t xml:space="preserve">4. Signal Processing: </w:t>
+      </w:r>
+      <w:r>
+        <w:rPr>
+          <w:rFonts w:ascii="TH Sarabun New" w:hAnsi="TH Sarabun New"/>
+          <w:sz w:val="32"/>
+        </w:rPr>
+        <w:t>ข้อมูลดิบ​ที่​ดึง​มา 730 รายการ, ข้อมูล​สะอาด​หลัง​คลี​น 700 รายการ</w:t>
+      </w:r>
+    </w:p>
+    <w:p>
+      <w:pPr>
+        <w:pStyle w:val="ListBullet"/>
+        <w:spacing w:after="60"/>
+        <w:jc w:val="left"/>
+      </w:pPr>
+      <w:r>
+        <w:rPr>
+          <w:rFonts w:ascii="TH Sarabun New" w:hAnsi="TH Sarabun New"/>
+          <w:b/>
+          <w:sz w:val="32"/>
+        </w:rPr>
+        <w:t xml:space="preserve">5. Software: </w:t>
       </w:r>
       <w:r>
         <w:rPr>
@@ -261,14 +327,14 @@
           <w:b/>
           <w:sz w:val="32"/>
         </w:rPr>
-        <w:t xml:space="preserve">3. Signal Processing: </w:t>
+        <w:t xml:space="preserve">6. Computer Vision and Pattern Recognition: </w:t>
       </w:r>
       <w:r>
         <w:rPr>
           <w:rFonts w:ascii="TH Sarabun New" w:hAnsi="TH Sarabun New"/>
           <w:sz w:val="32"/>
         </w:rPr>
-        <w:t>ข้อมูลดิบ​ที่​ดึง​มา 730 รายการ, ข้อมูล​สะอาด​หลัง​คลี​น 702 รายการ</w:t>
+        <w:t>ข้อมูลดิบ​ที่​ดึง​มา 730 รายการ, ข้อมูล​สะอาด​หลัง​คลี​น 705 รายการ</w:t>
       </w:r>
     </w:p>
     <w:p>
@@ -283,80 +349,14 @@
           <w:b/>
           <w:sz w:val="32"/>
         </w:rPr>
-        <w:t xml:space="preserve">4. Computer Vision and Pattern Recognition: </w:t>
+        <w:t xml:space="preserve">7. Computer Networks and Communications: </w:t>
       </w:r>
       <w:r>
         <w:rPr>
           <w:rFonts w:ascii="TH Sarabun New" w:hAnsi="TH Sarabun New"/>
           <w:sz w:val="32"/>
         </w:rPr>
-        <w:t>ข้อมูลดิบ​ที่​ดึง​มา 729 รายการ, ข้อมูล​สะอาด​หลัง​คลี​น 704 รายการ</w:t>
-      </w:r>
-    </w:p>
-    <w:p>
-      <w:pPr>
-        <w:pStyle w:val="ListBullet"/>
-        <w:spacing w:after="60"/>
-        <w:jc w:val="left"/>
-      </w:pPr>
-      <w:r>
-        <w:rPr>
-          <w:rFonts w:ascii="TH Sarabun New" w:hAnsi="TH Sarabun New"/>
-          <w:b/>
-          <w:sz w:val="32"/>
-        </w:rPr>
-        <w:t xml:space="preserve">5. Human-Computer Interaction: </w:t>
-      </w:r>
-      <w:r>
-        <w:rPr>
-          <w:rFonts w:ascii="TH Sarabun New" w:hAnsi="TH Sarabun New"/>
-          <w:sz w:val="32"/>
-        </w:rPr>
-        <w:t>ข้อมูลดิบ​ที่​ดึง​มา 729 รายการ, ข้อมูล​สะอาด​หลัง​คลี​น 703 รายการ</w:t>
-      </w:r>
-    </w:p>
-    <w:p>
-      <w:pPr>
-        <w:pStyle w:val="ListBullet"/>
-        <w:spacing w:after="60"/>
-        <w:jc w:val="left"/>
-      </w:pPr>
-      <w:r>
-        <w:rPr>
-          <w:rFonts w:ascii="TH Sarabun New" w:hAnsi="TH Sarabun New"/>
-          <w:b/>
-          <w:sz w:val="32"/>
-        </w:rPr>
-        <w:t xml:space="preserve">6. Computational Theory and Mathematics: </w:t>
-      </w:r>
-      <w:r>
-        <w:rPr>
-          <w:rFonts w:ascii="TH Sarabun New" w:hAnsi="TH Sarabun New"/>
-          <w:sz w:val="32"/>
-        </w:rPr>
-        <w:t>ข้อมูลดิบ​ที่​ดึง​มา 727 รายการ, ข้อมูล​สะอาด​หลัง​คลี​น 699 รายการ</w:t>
-      </w:r>
-    </w:p>
-    <w:p>
-      <w:pPr>
-        <w:pStyle w:val="ListBullet"/>
-        <w:spacing w:after="60"/>
-        <w:jc w:val="left"/>
-      </w:pPr>
-      <w:r>
-        <w:rPr>
-          <w:rFonts w:ascii="TH Sarabun New" w:hAnsi="TH Sarabun New"/>
-          <w:b/>
-          <w:sz w:val="32"/>
-        </w:rPr>
-        <w:t xml:space="preserve">7. Software: </w:t>
-      </w:r>
-      <w:r>
-        <w:rPr>
-          <w:rFonts w:ascii="TH Sarabun New" w:hAnsi="TH Sarabun New"/>
-          <w:sz w:val="32"/>
-        </w:rPr>
-        <w:t>ข้อมูลดิบ​ที่​ดึง​มา 727 รายการ, ข้อมูล​สะอาด​หลัง​คลี​น 700 รายการ</w:t>
+        <w:t>ข้อมูลดิบ​ที่​ดึง​มา 728 รายการ, ข้อมูล​สะอาด​หลัง​คลี​น 692 รายการ</w:t>
       </w:r>
     </w:p>
     <w:p>
@@ -378,7 +378,7 @@
           <w:rFonts w:ascii="TH Sarabun New" w:hAnsi="TH Sarabun New"/>
           <w:sz w:val="32"/>
         </w:rPr>
-        <w:t>ข้อมูลดิบ​ที่​ดึง​มา 725 รายการ, ข้อมูล​สะอาด​หลัง​คลี​น 697 รายการ</w:t>
+        <w:t>ข้อมูลดิบ​ที่​ดึง​มา 723 รายการ, ข้อมูล​สะอาด​หลัง​คลี​น 696 รายการ</w:t>
       </w:r>
     </w:p>
     <w:p>
@@ -393,14 +393,14 @@
           <w:b/>
           <w:sz w:val="32"/>
         </w:rPr>
-        <w:t xml:space="preserve">9. Computer Networks and Communications: </w:t>
+        <w:t xml:space="preserve">9. Computational Theory and Mathematics: </w:t>
       </w:r>
       <w:r>
         <w:rPr>
           <w:rFonts w:ascii="TH Sarabun New" w:hAnsi="TH Sarabun New"/>
           <w:sz w:val="32"/>
         </w:rPr>
-        <w:t>ข้อมูลดิบ​ที่​ดึง​มา 725 รายการ, ข้อมูล​สะอาด​หลัง​คลี​น 690 รายการ</w:t>
+        <w:t>ข้อมูลดิบ​ที่​ดึง​มา 722 รายการ, ข้อมูล​สะอาด​หลัง​คลี​น 699 รายการ</w:t>
       </w:r>
     </w:p>
     <w:p>
@@ -415,14 +415,14 @@
           <w:b/>
           <w:sz w:val="32"/>
         </w:rPr>
-        <w:t xml:space="preserve">10. Computer Graphics and Computer-Aided Design: </w:t>
+        <w:t xml:space="preserve">10. Human-Computer Interaction: </w:t>
       </w:r>
       <w:r>
         <w:rPr>
           <w:rFonts w:ascii="TH Sarabun New" w:hAnsi="TH Sarabun New"/>
           <w:sz w:val="32"/>
         </w:rPr>
-        <w:t>ข้อมูลดิบ​ที่​ดึง​มา 724 รายการ, ข้อมูล​สะอาด​หลัง​คลี​น 702 รายการ</w:t>
+        <w:t>ข้อมูลดิบ​ที่​ดึง​มา 719 รายการ, ข้อมูล​สะอาด​หลัง​คลี​น 698 รายการ</w:t>
       </w:r>
     </w:p>
     <w:p>
@@ -687,7 +687,7 @@
                 <w:rFonts w:ascii="TH Sarabun New" w:hAnsi="TH Sarabun New"/>
                 <w:sz w:val="30"/>
               </w:rPr>
-              <w:t>175</w:t>
+              <w:t>172</w:t>
             </w:r>
           </w:p>
         </w:tc>
@@ -710,7 +710,7 @@
                 <w:rFonts w:ascii="TH Sarabun New" w:hAnsi="TH Sarabun New"/>
                 <w:sz w:val="30"/>
               </w:rPr>
-              <w:t>7,105</w:t>
+              <w:t>7,108</w:t>
             </w:r>
           </w:p>
         </w:tc>
@@ -781,7 +781,7 @@
                 <w:rFonts w:ascii="TH Sarabun New" w:hAnsi="TH Sarabun New"/>
                 <w:sz w:val="30"/>
               </w:rPr>
-              <w:t>7,080</w:t>
+              <w:t>7,083</w:t>
             </w:r>
           </w:p>
         </w:tc>
@@ -852,7 +852,7 @@
                 <w:rFonts w:ascii="TH Sarabun New" w:hAnsi="TH Sarabun New"/>
                 <w:sz w:val="30"/>
               </w:rPr>
-              <w:t>7,020</w:t>
+              <w:t>7,023</w:t>
             </w:r>
           </w:p>
         </w:tc>
@@ -923,7 +923,7 @@
                 <w:rFonts w:ascii="TH Sarabun New" w:hAnsi="TH Sarabun New"/>
                 <w:sz w:val="30"/>
               </w:rPr>
-              <w:t>6,991</w:t>
+              <w:t>6,994</w:t>
             </w:r>
           </w:p>
         </w:tc>
@@ -1012,9 +1012,9 @@
         </w:rPr>
         <w:t>จาก​การสำรวจ​ชุด​ข้อมูล​สะอาด​จำนวน 6,991 รายการ พบ​ข้อมูล​เชิง​สถิติ​ที่​น่าสนใจ​ดังนี้:</w:t>
         <w:br/>
-        <w:t>1. แนวโน้ม​ปี​ที่​ตีพิมพ์: งานวิจัย​มี​การ​ตีพิมพ์​กระจาย​ตัว​ตั้งแต่​ปี 2020 ถึง 2026 โดย​มี​ปริมาณ​หนาแน่น​ที่สุด​ใน​ช่วง​ปี 2023–2024 (ปี 2023 มี 1,421 รายการ และ​ปี 2024 มี 1,573 รายการ) ซึ่ง​สะท้อน​ถึง​การ​เติบโต​อย่าง​ก้าว​กระโดด​ของ​งานวิจัย​ด้าน AI และ​ระบบ​อัตโนมัติ​ใน​ยุคปัจจุบัน</w:t>
+        <w:t>1. แนวโน้ม​ปี​ที่​ตีพิมพ์: งานวิจัย​มี​การ​ตีพิมพ์​กระจาย​ตัว​ตั้งแต่​ปี 2020 ถึง 2026 โดย​มี​ปริมาณ​หนาแน่น​ที่สุด​ใน​ช่วง​ปี 2023–2024 (ปี 2023 มี 1,408 รายการ และ​ปี 2024 มี 1,585 รายการ) ซึ่ง​สะท้อน​ถึง​การ​เติบโต​อย่าง​ก้าว​กระโดด​ของ​งานวิจัย​ด้าน AI และ​ระบบ​อัตโนมัติ​ใน​ยุคปัจจุบัน</w:t>
         <w:br/>
-        <w:t>2. สถิติ​การ​อ้างอิง: บทความ​ได้รับ​การ​อ้างอิง​เฉลี่ย 5.46 ครั้ง ค่า​มัธยฐาน 3.0 ครั้ง และ​มี​ค่าสูงสุด​ถึง 134 ครั้ง การ​กระจาย​ตัว​มี​ลักษณะ​แบบ​หางยาว (Long-tail Distribution) ที่​บทความ​ส่วนใหญ่​ได้รับ​การ​อ้างอิง​ระดับปานกลาง ขณะที่​บทความ​ด้าน Deep Learning ได้รับ​การ​อ้างอิง​สูง​เป็นพิเศษ</w:t>
+        <w:t>2. สถิติ​การ​อ้างอิง: บทความ​ได้รับ​การ​อ้างอิง​เฉลี่ย 5.41 ครั้ง ค่า​มัธยฐาน 3.0 ครั้ง และ​มี​ค่าสูงสุด​ถึง 134 ครั้ง การ​กระจาย​ตัว​มี​ลักษณะ​แบบ​หางยาว (Long-tail Distribution) ที่​บทความ​ส่วนใหญ่​ได้รับ​การ​อ้างอิง​ระดับปานกลาง ขณะที่​บทความ​ด้าน Deep Learning ได้รับ​การ​อ้างอิง​สูง​เป็นพิเศษ</w:t>
       </w:r>
     </w:p>
     <w:p>
@@ -1574,7 +1574,7 @@
           <w:rFonts w:ascii="TH Sarabun New" w:hAnsi="TH Sarabun New"/>
           <w:sz w:val="32"/>
         </w:rPr>
-        <w:t>โมเดล Transformer สำหรับ​งานวิจัย​ทางวิทยาศาสตร์ เช่น SPECTER2 (`allenai/specter2_base`) มี​ข้อจำกัด​สถาปัตยกรรม​ด้าน​ตำแหน่ง (Positional Embeddings) ที่​รับ​ความ​ยาว​ข้อความ​สูงสุด​ได้​ไม่​เกิน 512 โท​เค็น จาก​การ​วิเคราะห์​ใน​ชุด​ข้อมูล​สะอาด​จำนวน 6,991 รายการ พบ​ว่า​ข้อความ​รวม​มี​ความ​ยาว​เฉลี่ย 159.7 โท​เค็น และ​มี​บทความ​เพียง 0.0% ที่​มี​ความ​ยาว​เกิน 512 โท​เค็น​และ​จำเป็นต้อง​ถูก​ตัด (Truncation)</w:t>
+        <w:t>โมเดล Transformer สำหรับ​งานวิจัย​ทางวิทยาศาสตร์ เช่น SPECTER2 (`allenai/specter2_base`) มี​ข้อจำกัด​สถาปัตยกรรม​ด้าน​ตำแหน่ง (Positional Embeddings) ที่​รับ​ความ​ยาว​ข้อความ​สูงสุด​ได้​ไม่​เกิน 512 โท​เค็น จาก​การ​วิเคราะห์​ใน​ชุด​ข้อมูล​สะอาด​จำนวน 6,991 รายการ พบ​ว่า​ข้อความ​รวม​มี​ความ​ยาว​เฉลี่ย 160.6 โท​เค็น และ​มี​บทความ​เพียง 0.0% ที่​มี​ความ​ยาว​เกิน 512 โท​เค็น​และ​จำเป็นต้อง​ถูก​ตัด (Truncation)</w:t>
         <w:br/>
         <w:br/>
         <w:t>ผลกระทบ​จาก​การ​ตัด​ข้อความ​ที่​เกิน 512 โท​เค็น: เนื่องจาก​โครงสร้าง​การ​รวม​ข้อความ​ได้​วาง 'Author keywords' และ 'Index keywords' ไว้​ที่​ส่วน​ท้ายสุด​ของ​ข้อความ หาก​บทความ​ใด​มี Abstract ที่​ยาว​มาก คำ​สำคัญ​บางส่วน​อาจ​ถูก​ตัดทิ้ง​ไม่​ถูก​นำ​เข้าไป​คำนวณ​ใน​โมเดล อย่างไรก็ตาม Title และ​สาระสำคัญ​ส่วนใหญ่​ใน Abstract ยังคง​ได้รับ​การ​แปลง​เป็น​เวกเตอร์​อย่าง​ครบถ้วน ทำให้​เวกเตอร์​ความหมาย​ยังคง​มี​ความแม่นยำ​สูง</w:t>

</xml_diff>